<commit_message>
Adicionando: Versão com Declaração de Hipossuficiência
</commit_message>
<xml_diff>
--- a/assets/templates/bpc_template_unificado.docx
+++ b/assets/templates/bpc_template_unificado.docx
@@ -1,6 +1,6 @@
 
 <file path=word/document.xml><?xml version="1.0" encoding="utf-8"?>
-<w:document xmlns:wpc="http://schemas.microsoft.com/office/word/2010/wordprocessingCanvas" xmlns:cx="http://schemas.microsoft.com/office/drawing/2014/chartex" xmlns:cx1="http://schemas.microsoft.com/office/drawing/2015/9/8/chartex" xmlns:cx2="http://schemas.microsoft.com/office/drawing/2015/10/21/chartex" xmlns:cx3="http://schemas.microsoft.com/office/drawing/2016/5/9/chartex" xmlns:cx4="http://schemas.microsoft.com/office/drawing/2016/5/10/chartex" xmlns:cx5="http://schemas.microsoft.com/office/drawing/2016/5/11/chartex" xmlns:cx6="http://schemas.microsoft.com/office/drawing/2016/5/12/chartex" xmlns:cx7="http://schemas.microsoft.com/office/drawing/2016/5/13/chartex" xmlns:cx8="http://schemas.microsoft.com/office/drawing/2016/5/14/chartex" xmlns:mc="http://schemas.openxmlformats.org/markup-compatibility/2006" xmlns:aink="http://schemas.microsoft.com/office/drawing/2016/ink" xmlns:am3d="http://schemas.microsoft.com/office/drawing/2017/model3d" xmlns:o="urn:schemas-microsoft-com:office:office" xmlns:r="http://schemas.openxmlformats.org/officeDocument/2006/relationships" xmlns:m="http://schemas.openxmlformats.org/officeDocument/2006/math" xmlns:v="urn:schemas-microsoft-com:vml" xmlns:wp14="http://schemas.microsoft.com/office/word/2010/wordprocessingDrawing" xmlns:wp="http://schemas.openxmlformats.org/drawingml/2006/wordprocessingDrawing" xmlns:w10="urn:schemas-microsoft-com:office:word" xmlns:w="http://schemas.openxmlformats.org/wordprocessingml/2006/main" xmlns:w14="http://schemas.microsoft.com/office/word/2010/wordml" xmlns:w15="http://schemas.microsoft.com/office/word/2012/wordml" xmlns:w16cex="http://schemas.microsoft.com/office/word/2018/wordml/cex" xmlns:w16cid="http://schemas.microsoft.com/office/word/2016/wordml/cid" xmlns:w16="http://schemas.microsoft.com/office/word/2018/wordml" xmlns:w16se="http://schemas.microsoft.com/office/word/2015/wordml/symex" xmlns:wpg="http://schemas.microsoft.com/office/word/2010/wordprocessingGroup" xmlns:wpi="http://schemas.microsoft.com/office/word/2010/wordprocessingInk" xmlns:wne="http://schemas.microsoft.com/office/word/2006/wordml" xmlns:wps="http://schemas.microsoft.com/office/word/2010/wordprocessingShape" mc:Ignorable="w14 w15 w16se w16cid w16 w16cex wp14">
+<w:document xmlns:wpc="http://schemas.microsoft.com/office/word/2010/wordprocessingCanvas" xmlns:cx="http://schemas.microsoft.com/office/drawing/2014/chartex" xmlns:cx1="http://schemas.microsoft.com/office/drawing/2015/9/8/chartex" xmlns:cx2="http://schemas.microsoft.com/office/drawing/2015/10/21/chartex" xmlns:cx3="http://schemas.microsoft.com/office/drawing/2016/5/9/chartex" xmlns:cx4="http://schemas.microsoft.com/office/drawing/2016/5/10/chartex" xmlns:cx5="http://schemas.microsoft.com/office/drawing/2016/5/11/chartex" xmlns:cx6="http://schemas.microsoft.com/office/drawing/2016/5/12/chartex" xmlns:cx7="http://schemas.microsoft.com/office/drawing/2016/5/13/chartex" xmlns:cx8="http://schemas.microsoft.com/office/drawing/2016/5/14/chartex" xmlns:mc="http://schemas.openxmlformats.org/markup-compatibility/2006" xmlns:aink="http://schemas.microsoft.com/office/drawing/2016/ink" xmlns:am3d="http://schemas.microsoft.com/office/drawing/2017/model3d" xmlns:o="urn:schemas-microsoft-com:office:office" xmlns:oel="http://schemas.microsoft.com/office/2019/extlst" xmlns:r="http://schemas.openxmlformats.org/officeDocument/2006/relationships" xmlns:m="http://schemas.openxmlformats.org/officeDocument/2006/math" xmlns:v="urn:schemas-microsoft-com:vml" xmlns:wp14="http://schemas.microsoft.com/office/word/2010/wordprocessingDrawing" xmlns:wp="http://schemas.openxmlformats.org/drawingml/2006/wordprocessingDrawing" xmlns:w10="urn:schemas-microsoft-com:office:word" xmlns:w="http://schemas.openxmlformats.org/wordprocessingml/2006/main" xmlns:w14="http://schemas.microsoft.com/office/word/2010/wordml" xmlns:w15="http://schemas.microsoft.com/office/word/2012/wordml" xmlns:w16cex="http://schemas.microsoft.com/office/word/2018/wordml/cex" xmlns:w16cid="http://schemas.microsoft.com/office/word/2016/wordml/cid" xmlns:w16="http://schemas.microsoft.com/office/word/2018/wordml" xmlns:w16du="http://schemas.microsoft.com/office/word/2023/wordml/word16du" xmlns:w16sdtdh="http://schemas.microsoft.com/office/word/2020/wordml/sdtdatahash" xmlns:w16sdtfl="http://schemas.microsoft.com/office/word/2024/wordml/sdtformatlock" xmlns:w16se="http://schemas.microsoft.com/office/word/2015/wordml/symex" xmlns:wpg="http://schemas.microsoft.com/office/word/2010/wordprocessingGroup" xmlns:wpi="http://schemas.microsoft.com/office/word/2010/wordprocessingInk" xmlns:wne="http://schemas.microsoft.com/office/word/2006/wordml" xmlns:wps="http://schemas.microsoft.com/office/word/2010/wordprocessingShape" mc:Ignorable="w14 w15 w16se w16cid w16 w16cex w16sdtdh w16sdtfl w16du wp14">
   <w:body>
     <w:p>
       <w:pPr>
@@ -393,7 +393,7 @@
           </mc:Choice>
           <mc:Fallback>
             <w:pict>
-              <v:roundrect w14:anchorId="2E5CC425" id="Retângulo: Cantos Arredondados 5" o:spid="_x0000_s1026" style="position:absolute;margin-left:0;margin-top:4.5pt;width:472.8pt;height:44.4pt;z-index:251703296;visibility:visible;mso-wrap-style:square;mso-width-percent:0;mso-height-percent:0;mso-wrap-distance-left:9pt;mso-wrap-distance-top:0;mso-wrap-distance-right:9pt;mso-wrap-distance-bottom:0;mso-position-horizontal:center;mso-position-horizontal-relative:margin;mso-position-vertical:absolute;mso-position-vertical-relative:text;mso-width-percent:0;mso-height-percent:0;mso-width-relative:margin;mso-height-relative:margin;v-text-anchor:middle" arcsize="10923f" o:gfxdata="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" fillcolor="#c0bcbe" stroked="f" strokeweight="1pt">
+              <v:roundrect w14:anchorId="2E5CC425" id="Retângulo: Cantos Arredondados 5" o:spid="_x0000_s1026" style="position:absolute;margin-left:0;margin-top:4.5pt;width:472.8pt;height:44.4pt;z-index:251703296;visibility:visible;mso-wrap-style:square;mso-width-percent:0;mso-height-percent:0;mso-wrap-distance-left:9pt;mso-wrap-distance-top:0;mso-wrap-distance-right:9pt;mso-wrap-distance-bottom:0;mso-position-horizontal:center;mso-position-horizontal-relative:margin;mso-position-vertical:absolute;mso-position-vertical-relative:text;mso-width-percent:0;mso-height-percent:0;mso-width-relative:margin;mso-height-relative:margin;v-text-anchor:middle" arcsize="10923f" o:gfxdata="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" fillcolor="#c0bcbe" stroked="f" strokeweight="1pt">
                 <v:stroke joinstyle="miter"/>
                 <v:textbox>
                   <w:txbxContent>
@@ -620,7 +620,7 @@
           </mc:Choice>
           <mc:Fallback>
             <w:pict>
-              <v:roundrect w14:anchorId="489C4FDE" id="Retângulo: Cantos Arredondados 6" o:spid="_x0000_s1027" style="position:absolute;left:0;text-align:left;margin-left:0;margin-top:7.9pt;width:339.6pt;height:30.65pt;z-index:251704320;visibility:visible;mso-wrap-style:square;mso-width-percent:0;mso-height-percent:0;mso-wrap-distance-left:9pt;mso-wrap-distance-top:0;mso-wrap-distance-right:9pt;mso-wrap-distance-bottom:0;mso-position-horizontal:center;mso-position-horizontal-relative:page;mso-position-vertical:absolute;mso-position-vertical-relative:text;mso-width-percent:0;mso-height-percent:0;mso-width-relative:margin;mso-height-relative:margin;v-text-anchor:middle" arcsize="10923f" o:gfxdata="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" fillcolor="#c0bcbe" stroked="f" strokeweight="1pt">
+              <v:roundrect w14:anchorId="489C4FDE" id="Retângulo: Cantos Arredondados 6" o:spid="_x0000_s1027" style="position:absolute;left:0;text-align:left;margin-left:0;margin-top:7.9pt;width:339.6pt;height:30.65pt;z-index:251704320;visibility:visible;mso-wrap-style:square;mso-width-percent:0;mso-height-percent:0;mso-wrap-distance-left:9pt;mso-wrap-distance-top:0;mso-wrap-distance-right:9pt;mso-wrap-distance-bottom:0;mso-position-horizontal:center;mso-position-horizontal-relative:page;mso-position-vertical:absolute;mso-position-vertical-relative:text;mso-width-percent:0;mso-height-percent:0;mso-width-relative:margin;mso-height-relative:margin;v-text-anchor:middle" arcsize="10923f" o:gfxdata="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" fillcolor="#c0bcbe" stroked="f" strokeweight="1pt">
                 <v:stroke joinstyle="miter"/>
                 <v:textbox>
                   <w:txbxContent>
@@ -803,7 +803,7 @@
           </mc:Choice>
           <mc:Fallback>
             <w:pict>
-              <v:roundrect w14:anchorId="5FDDB3DB" id="Retângulo: Cantos Arredondados 1999185315" o:spid="_x0000_s1028" style="position:absolute;left:0;text-align:left;margin-left:0;margin-top:4.7pt;width:339.6pt;height:30.65pt;z-index:251709440;visibility:visible;mso-wrap-style:square;mso-width-percent:0;mso-height-percent:0;mso-wrap-distance-left:9pt;mso-wrap-distance-top:0;mso-wrap-distance-right:9pt;mso-wrap-distance-bottom:0;mso-position-horizontal:center;mso-position-horizontal-relative:margin;mso-position-vertical:absolute;mso-position-vertical-relative:text;mso-width-percent:0;mso-height-percent:0;mso-width-relative:margin;mso-height-relative:margin;v-text-anchor:middle" arcsize="10923f" o:gfxdata="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" fillcolor="#c0bcbe" stroked="f" strokeweight="1pt">
+              <v:roundrect w14:anchorId="5FDDB3DB" id="Retângulo: Cantos Arredondados 1999185315" o:spid="_x0000_s1028" style="position:absolute;left:0;text-align:left;margin-left:0;margin-top:4.7pt;width:339.6pt;height:30.65pt;z-index:251709440;visibility:visible;mso-wrap-style:square;mso-width-percent:0;mso-height-percent:0;mso-wrap-distance-left:9pt;mso-wrap-distance-top:0;mso-wrap-distance-right:9pt;mso-wrap-distance-bottom:0;mso-position-horizontal:center;mso-position-horizontal-relative:margin;mso-position-vertical:absolute;mso-position-vertical-relative:text;mso-width-percent:0;mso-height-percent:0;mso-width-relative:margin;mso-height-relative:margin;v-text-anchor:middle" arcsize="10923f" o:gfxdata="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" fillcolor="#c0bcbe" stroked="f" strokeweight="1pt">
                 <v:stroke joinstyle="miter"/>
                 <v:textbox>
                   <w:txbxContent>
@@ -875,7 +875,7 @@
           <w:sz w:val="24"/>
           <w:szCs w:val="24"/>
         </w:rPr>
-        <w:t>{{ diagnostico_cid }}</w:t>
+        <w:t>{{ diagnosticos_texto_corrido }}</w:t>
       </w:r>
       <w:r>
         <w:rPr>
@@ -1227,7 +1227,7 @@
           </mc:Choice>
           <mc:Fallback>
             <w:pict>
-              <v:roundrect w14:anchorId="44B45B71" id="Retângulo: Cantos Arredondados 4" o:spid="_x0000_s1029" style="position:absolute;left:0;text-align:left;margin-left:0;margin-top:1pt;width:339.6pt;height:30.65pt;z-index:251711488;visibility:visible;mso-wrap-style:square;mso-width-percent:0;mso-height-percent:0;mso-wrap-distance-left:9pt;mso-wrap-distance-top:0;mso-wrap-distance-right:9pt;mso-wrap-distance-bottom:0;mso-position-horizontal:center;mso-position-horizontal-relative:page;mso-position-vertical:absolute;mso-position-vertical-relative:text;mso-width-percent:0;mso-height-percent:0;mso-width-relative:margin;mso-height-relative:margin;v-text-anchor:middle" arcsize="10923f" o:gfxdata="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" fillcolor="#c0bcbe" stroked="f" strokeweight="1pt">
+              <v:roundrect w14:anchorId="44B45B71" id="Retângulo: Cantos Arredondados 4" o:spid="_x0000_s1029" style="position:absolute;left:0;text-align:left;margin-left:0;margin-top:1pt;width:339.6pt;height:30.65pt;z-index:251711488;visibility:visible;mso-wrap-style:square;mso-width-percent:0;mso-height-percent:0;mso-wrap-distance-left:9pt;mso-wrap-distance-top:0;mso-wrap-distance-right:9pt;mso-wrap-distance-bottom:0;mso-position-horizontal:center;mso-position-horizontal-relative:page;mso-position-vertical:absolute;mso-position-vertical-relative:text;mso-width-percent:0;mso-height-percent:0;mso-width-relative:margin;mso-height-relative:margin;v-text-anchor:middle" arcsize="10923f" o:gfxdata="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" fillcolor="#c0bcbe" stroked="f" strokeweight="1pt">
                 <v:stroke joinstyle="miter"/>
                 <v:textbox>
                   <w:txbxContent>
@@ -1725,7 +1725,7 @@
           </mc:Choice>
           <mc:Fallback>
             <w:pict>
-              <v:roundrect w14:anchorId="52A28E0F" id="Retângulo: Cantos Arredondados 15" o:spid="_x0000_s1030" style="position:absolute;left:0;text-align:left;margin-left:0;margin-top:1.55pt;width:341.75pt;height:46.65pt;z-index:251713536;visibility:visible;mso-wrap-style:square;mso-width-percent:0;mso-height-percent:0;mso-wrap-distance-left:9pt;mso-wrap-distance-top:0;mso-wrap-distance-right:9pt;mso-wrap-distance-bottom:0;mso-position-horizontal:center;mso-position-horizontal-relative:page;mso-position-vertical:absolute;mso-position-vertical-relative:text;mso-width-percent:0;mso-height-percent:0;mso-width-relative:margin;mso-height-relative:margin;v-text-anchor:middle" arcsize="10923f" o:gfxdata="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" fillcolor="#c0bcbe" stroked="f" strokeweight="1pt">
+              <v:roundrect w14:anchorId="52A28E0F" id="Retângulo: Cantos Arredondados 15" o:spid="_x0000_s1030" style="position:absolute;left:0;text-align:left;margin-left:0;margin-top:1.55pt;width:341.75pt;height:46.65pt;z-index:251713536;visibility:visible;mso-wrap-style:square;mso-width-percent:0;mso-height-percent:0;mso-wrap-distance-left:9pt;mso-wrap-distance-top:0;mso-wrap-distance-right:9pt;mso-wrap-distance-bottom:0;mso-position-horizontal:center;mso-position-horizontal-relative:page;mso-position-vertical:absolute;mso-position-vertical-relative:text;mso-width-percent:0;mso-height-percent:0;mso-width-relative:margin;mso-height-relative:margin;v-text-anchor:middle" arcsize="10923f" o:gfxdata="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" fillcolor="#c0bcbe" stroked="f" strokeweight="1pt">
                 <v:stroke joinstyle="miter"/>
                 <v:textbox>
                   <w:txbxContent>
@@ -1825,7 +1825,7 @@
           <w:sz w:val="24"/>
           <w:szCs w:val="24"/>
         </w:rPr>
-        <w:t>{{ diagnostico_cid }}</w:t>
+        <w:t>{{ diagnosticos_texto_corrido }}</w:t>
       </w:r>
       <w:r>
         <w:rPr>
@@ -2125,7 +2125,7 @@
           </mc:Choice>
           <mc:Fallback>
             <w:pict>
-              <v:roundrect w14:anchorId="3E61283F" id="Retângulo: Cantos Arredondados 17" o:spid="_x0000_s1031" style="position:absolute;left:0;text-align:left;margin-left:0;margin-top:.95pt;width:448.2pt;height:46.65pt;z-index:251715584;visibility:visible;mso-wrap-style:square;mso-width-percent:0;mso-height-percent:0;mso-wrap-distance-left:9pt;mso-wrap-distance-top:0;mso-wrap-distance-right:9pt;mso-wrap-distance-bottom:0;mso-position-horizontal:left;mso-position-horizontal-relative:margin;mso-position-vertical:absolute;mso-position-vertical-relative:text;mso-width-percent:0;mso-height-percent:0;mso-width-relative:margin;mso-height-relative:margin;v-text-anchor:middle" arcsize="10923f" o:gfxdata="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" fillcolor="#c0bcbe" stroked="f" strokeweight="1pt">
+              <v:roundrect w14:anchorId="3E61283F" id="Retângulo: Cantos Arredondados 17" o:spid="_x0000_s1031" style="position:absolute;left:0;text-align:left;margin-left:0;margin-top:.95pt;width:448.2pt;height:46.65pt;z-index:251715584;visibility:visible;mso-wrap-style:square;mso-width-percent:0;mso-height-percent:0;mso-wrap-distance-left:9pt;mso-wrap-distance-top:0;mso-wrap-distance-right:9pt;mso-wrap-distance-bottom:0;mso-position-horizontal:left;mso-position-horizontal-relative:margin;mso-position-vertical:absolute;mso-position-vertical-relative:text;mso-width-percent:0;mso-height-percent:0;mso-width-relative:margin;mso-height-relative:margin;v-text-anchor:middle" arcsize="10923f" o:gfxdata="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" fillcolor="#c0bcbe" stroked="f" strokeweight="1pt">
                 <v:stroke joinstyle="miter"/>
                 <v:textbox>
                   <w:txbxContent>
@@ -2380,7 +2380,7 @@
           <w:sz w:val="24"/>
           <w:szCs w:val="24"/>
         </w:rPr>
-        <w:t>{{ diagnostico_cid }}</w:t>
+        <w:t>{{ diagnosticos_texto_corrido }}</w:t>
       </w:r>
       <w:r>
         <w:rPr>
@@ -2779,7 +2779,7 @@
           </mc:Choice>
           <mc:Fallback>
             <w:pict>
-              <v:roundrect w14:anchorId="34C4C7AD" id="Retângulo Arredondado 2" o:spid="_x0000_s1032" style="position:absolute;left:0;text-align:left;margin-left:401.1pt;margin-top:24.65pt;width:452.3pt;height:38.55pt;z-index:251717632;visibility:visible;mso-wrap-style:square;mso-width-percent:0;mso-height-percent:0;mso-wrap-distance-left:9pt;mso-wrap-distance-top:0;mso-wrap-distance-right:9pt;mso-wrap-distance-bottom:0;mso-position-horizontal:right;mso-position-horizontal-relative:margin;mso-position-vertical:absolute;mso-position-vertical-relative:text;mso-width-percent:0;mso-height-percent:0;mso-width-relative:margin;mso-height-relative:margin;v-text-anchor:middle" arcsize="10923f" o:gfxdata="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" fillcolor="#bebfc2" stroked="f" strokeweight="2pt">
+              <v:roundrect w14:anchorId="34C4C7AD" id="Retângulo Arredondado 2" o:spid="_x0000_s1032" style="position:absolute;left:0;text-align:left;margin-left:401.1pt;margin-top:24.65pt;width:452.3pt;height:38.55pt;z-index:251717632;visibility:visible;mso-wrap-style:square;mso-width-percent:0;mso-height-percent:0;mso-wrap-distance-left:9pt;mso-wrap-distance-top:0;mso-wrap-distance-right:9pt;mso-wrap-distance-bottom:0;mso-position-horizontal:right;mso-position-horizontal-relative:margin;mso-position-vertical:absolute;mso-position-vertical-relative:text;mso-width-percent:0;mso-height-percent:0;mso-width-relative:margin;mso-height-relative:margin;v-text-anchor:middle" arcsize="10923f" o:gfxdata="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" fillcolor="#bebfc2" stroked="f" strokeweight="2pt">
                 <v:textbox>
                   <w:txbxContent>
                     <w:p>
@@ -2956,7 +2956,7 @@
         <w:t xml:space="preserve"> é conclusivo ao atestar que a parte autora é portadora de </w:t>
       </w:r>
       <w:r>
-        <w:t>{{ diagnostico_cid }}</w:t>
+        <w:t>{{ diagnosticos_texto_corrido }}</w:t>
       </w:r>
       <w:r>
         <w:rPr>
@@ -3395,7 +3395,7 @@
           </mc:Choice>
           <mc:Fallback>
             <w:pict>
-              <v:roundrect w14:anchorId="7CF663BA" id="_x0000_s1033" style="position:absolute;left:0;text-align:left;margin-left:0;margin-top:16.6pt;width:323.5pt;height:32.4pt;z-index:251719680;visibility:visible;mso-wrap-style:square;mso-width-percent:0;mso-height-percent:0;mso-wrap-distance-left:9pt;mso-wrap-distance-top:0;mso-wrap-distance-right:9pt;mso-wrap-distance-bottom:0;mso-position-horizontal:center;mso-position-horizontal-relative:margin;mso-position-vertical:absolute;mso-position-vertical-relative:text;mso-width-percent:0;mso-height-percent:0;mso-width-relative:margin;mso-height-relative:margin;v-text-anchor:middle" arcsize="10923f" o:gfxdata="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" fillcolor="#bebfc2" stroked="f" strokeweight="2pt">
+              <v:roundrect w14:anchorId="7CF663BA" id="_x0000_s1033" style="position:absolute;left:0;text-align:left;margin-left:0;margin-top:16.6pt;width:323.5pt;height:32.4pt;z-index:251719680;visibility:visible;mso-wrap-style:square;mso-width-percent:0;mso-height-percent:0;mso-wrap-distance-left:9pt;mso-wrap-distance-top:0;mso-wrap-distance-right:9pt;mso-wrap-distance-bottom:0;mso-position-horizontal:center;mso-position-horizontal-relative:margin;mso-position-vertical:absolute;mso-position-vertical-relative:text;mso-width-percent:0;mso-height-percent:0;mso-width-relative:margin;mso-height-relative:margin;v-text-anchor:middle" arcsize="10923f" o:gfxdata="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" fillcolor="#bebfc2" stroked="f" strokeweight="2pt">
                 <v:textbox>
                   <w:txbxContent>
                     <w:p>
@@ -3902,7 +3902,7 @@
           </mc:Choice>
           <mc:Fallback>
             <w:pict>
-              <v:roundrect w14:anchorId="6EB7A1F4" id="_x0000_s1034" style="position:absolute;left:0;text-align:left;margin-left:0;margin-top:8.7pt;width:340pt;height:30.65pt;z-index:251721728;visibility:visible;mso-wrap-style:square;mso-width-percent:0;mso-height-percent:0;mso-wrap-distance-left:9pt;mso-wrap-distance-top:0;mso-wrap-distance-right:9pt;mso-wrap-distance-bottom:0;mso-position-horizontal:center;mso-position-horizontal-relative:page;mso-position-vertical:absolute;mso-position-vertical-relative:text;mso-width-percent:0;mso-height-percent:0;mso-width-relative:margin;mso-height-relative:margin;v-text-anchor:middle" arcsize="10923f" o:gfxdata="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" fillcolor="#bebfc2" stroked="f" strokeweight="2pt">
+              <v:roundrect w14:anchorId="6EB7A1F4" id="_x0000_s1034" style="position:absolute;left:0;text-align:left;margin-left:0;margin-top:8.7pt;width:340pt;height:30.65pt;z-index:251721728;visibility:visible;mso-wrap-style:square;mso-width-percent:0;mso-height-percent:0;mso-wrap-distance-left:9pt;mso-wrap-distance-top:0;mso-wrap-distance-right:9pt;mso-wrap-distance-bottom:0;mso-position-horizontal:center;mso-position-horizontal-relative:page;mso-position-vertical:absolute;mso-position-vertical-relative:text;mso-width-percent:0;mso-height-percent:0;mso-width-relative:margin;mso-height-relative:margin;v-text-anchor:middle" arcsize="10923f" o:gfxdata="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" fillcolor="#bebfc2" stroked="f" strokeweight="2pt">
                 <v:textbox>
                   <w:txbxContent>
                     <w:p>
@@ -4433,7 +4433,7 @@
           </mc:Choice>
           <mc:Fallback>
             <w:pict>
-              <v:roundrect w14:anchorId="6925031D" id="_x0000_s1035" style="position:absolute;left:0;text-align:left;margin-left:0;margin-top:3.7pt;width:340pt;height:30.65pt;z-index:251707392;visibility:visible;mso-wrap-style:square;mso-width-percent:0;mso-height-percent:0;mso-wrap-distance-left:9pt;mso-wrap-distance-top:0;mso-wrap-distance-right:9pt;mso-wrap-distance-bottom:0;mso-position-horizontal:center;mso-position-horizontal-relative:page;mso-position-vertical:absolute;mso-position-vertical-relative:text;mso-width-percent:0;mso-height-percent:0;mso-width-relative:margin;mso-height-relative:margin;v-text-anchor:middle" arcsize="10923f" o:gfxdata="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" fillcolor="#bebfc2" stroked="f" strokeweight="2pt">
+              <v:roundrect w14:anchorId="6925031D" id="_x0000_s1035" style="position:absolute;left:0;text-align:left;margin-left:0;margin-top:3.7pt;width:340pt;height:30.65pt;z-index:251707392;visibility:visible;mso-wrap-style:square;mso-width-percent:0;mso-height-percent:0;mso-wrap-distance-left:9pt;mso-wrap-distance-top:0;mso-wrap-distance-right:9pt;mso-wrap-distance-bottom:0;mso-position-horizontal:center;mso-position-horizontal-relative:page;mso-position-vertical:absolute;mso-position-vertical-relative:text;mso-width-percent:0;mso-height-percent:0;mso-width-relative:margin;mso-height-relative:margin;v-text-anchor:middle" arcsize="10923f" o:gfxdata="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" fillcolor="#bebfc2" stroked="f" strokeweight="2pt">
                 <v:textbox>
                   <w:txbxContent>
                     <w:p>
@@ -4633,7 +4633,7 @@
           </mc:Choice>
           <mc:Fallback>
             <w:pict>
-              <v:roundrect w14:anchorId="1EB8DAC5" id="Retângulo: Cantos Arredondados 7" o:spid="_x0000_s1036" style="position:absolute;margin-left:0;margin-top:12.3pt;width:335.4pt;height:30pt;z-index:251705344;visibility:visible;mso-wrap-style:square;mso-width-percent:0;mso-height-percent:0;mso-wrap-distance-left:9pt;mso-wrap-distance-top:0;mso-wrap-distance-right:9pt;mso-wrap-distance-bottom:0;mso-position-horizontal:center;mso-position-horizontal-relative:page;mso-position-vertical:absolute;mso-position-vertical-relative:text;mso-width-percent:0;mso-height-percent:0;mso-width-relative:margin;mso-height-relative:margin;v-text-anchor:middle" arcsize="10923f" o:gfxdata="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" fillcolor="#c0bcbe" stroked="f" strokeweight="1pt">
+              <v:roundrect w14:anchorId="1EB8DAC5" id="Retângulo: Cantos Arredondados 7" o:spid="_x0000_s1036" style="position:absolute;margin-left:0;margin-top:12.3pt;width:335.4pt;height:30pt;z-index:251705344;visibility:visible;mso-wrap-style:square;mso-width-percent:0;mso-height-percent:0;mso-wrap-distance-left:9pt;mso-wrap-distance-top:0;mso-wrap-distance-right:9pt;mso-wrap-distance-bottom:0;mso-position-horizontal:center;mso-position-horizontal-relative:page;mso-position-vertical:absolute;mso-position-vertical-relative:text;mso-width-percent:0;mso-height-percent:0;mso-width-relative:margin;mso-height-relative:margin;v-text-anchor:middle" arcsize="10923f" o:gfxdata="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" fillcolor="#c0bcbe" stroked="f" strokeweight="1pt">
                 <v:stroke joinstyle="miter"/>
                 <v:textbox>
                   <w:txbxContent>
@@ -4863,38 +4863,49 @@
     <w:p>
       <w:pPr>
         <w:pStyle w:val="PargrafodaLista"/>
-        <w:numPr>
-          <w:ilvl w:val="0"/>
-          <w:numId w:val="20"/>
-        </w:numPr>
         <w:spacing w:before="7"/>
+        <w:ind w:left="1069"/>
         <w:rPr>
           <w:b/>
           <w:bCs/>
-          <w:i/>
-          <w:iCs/>
           <w:sz w:val="24"/>
           <w:szCs w:val="24"/>
           <w:u w:val="single"/>
         </w:rPr>
       </w:pPr>
-      <w:r>
-        <w:rPr>
-          <w:u w:val="single"/>
-        </w:rPr>
-        <w:t>{{ diagnostico_cid }}</w:t>
-      </w:r>
       <w:r>
         <w:rPr>
           <w:b/>
           <w:bCs/>
-          <w:i/>
-          <w:iCs/>
           <w:sz w:val="24"/>
           <w:szCs w:val="24"/>
           <w:u w:val="single"/>
         </w:rPr>
-        <w:t>.</w:t>
+        <w:t>{% for item in lista_diagnosticos %}{{ item }}</w:t>
+      </w:r>
+    </w:p>
+    <w:p>
+      <w:pPr>
+        <w:pStyle w:val="PargrafodaLista"/>
+        <w:spacing w:before="7"/>
+        <w:ind w:left="1069"/>
+        <w:rPr>
+          <w:b/>
+          <w:bCs/>
+          <w:sz w:val="24"/>
+          <w:szCs w:val="24"/>
+          <w:u w:val="single"/>
+        </w:rPr>
+      </w:pPr>
+      <w:r>
+        <w:rPr>
+          <w:b/>
+          <w:bCs/>
+          <w:sz w:val="24"/>
+          <w:szCs w:val="24"/>
+          <w:u w:val="single"/>
+        </w:rPr>
+        <w:t>{% endfor %}</w:t>
       </w:r>
     </w:p>
     <w:p>
@@ -5404,7 +5415,7 @@
           </mc:Choice>
           <mc:Fallback>
             <w:pict>
-              <v:roundrect w14:anchorId="732D4B67" id="Retângulo: Cantos Arredondados 14" o:spid="_x0000_s1037" style="position:absolute;left:0;text-align:left;margin-left:0;margin-top:17.9pt;width:335.4pt;height:30.65pt;z-index:251695104;visibility:visible;mso-wrap-style:square;mso-width-percent:0;mso-height-percent:0;mso-wrap-distance-left:9pt;mso-wrap-distance-top:0;mso-wrap-distance-right:9pt;mso-wrap-distance-bottom:0;mso-position-horizontal:center;mso-position-horizontal-relative:margin;mso-position-vertical:absolute;mso-position-vertical-relative:text;mso-width-percent:0;mso-height-percent:0;mso-width-relative:margin;mso-height-relative:margin;v-text-anchor:middle" arcsize="10923f" o:gfxdata="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" fillcolor="#c0bcbe" stroked="f" strokeweight="1pt">
+              <v:roundrect w14:anchorId="732D4B67" id="Retângulo: Cantos Arredondados 14" o:spid="_x0000_s1037" style="position:absolute;left:0;text-align:left;margin-left:0;margin-top:17.9pt;width:335.4pt;height:30.65pt;z-index:251695104;visibility:visible;mso-wrap-style:square;mso-width-percent:0;mso-height-percent:0;mso-wrap-distance-left:9pt;mso-wrap-distance-top:0;mso-wrap-distance-right:9pt;mso-wrap-distance-bottom:0;mso-position-horizontal:center;mso-position-horizontal-relative:margin;mso-position-vertical:absolute;mso-position-vertical-relative:text;mso-width-percent:0;mso-height-percent:0;mso-width-relative:margin;mso-height-relative:margin;v-text-anchor:middle" arcsize="10923f" o:gfxdata="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" fillcolor="#c0bcbe" stroked="f" strokeweight="1pt">
                 <v:stroke joinstyle="miter"/>
                 <v:textbox>
                   <w:txbxContent>
@@ -5652,7 +5663,7 @@
           </mc:Choice>
           <mc:Fallback>
             <w:pict>
-              <v:roundrect w14:anchorId="3E72F790" id="Retângulo: Cantos Arredondados 16" o:spid="_x0000_s1038" style="position:absolute;left:0;text-align:left;margin-left:0;margin-top:12.65pt;width:335.4pt;height:28.65pt;z-index:251697152;visibility:visible;mso-wrap-style:square;mso-width-percent:0;mso-height-percent:0;mso-wrap-distance-left:9pt;mso-wrap-distance-top:0;mso-wrap-distance-right:9pt;mso-wrap-distance-bottom:0;mso-position-horizontal:center;mso-position-horizontal-relative:margin;mso-position-vertical:absolute;mso-position-vertical-relative:text;mso-width-percent:0;mso-height-percent:0;mso-width-relative:margin;mso-height-relative:margin;v-text-anchor:middle" arcsize="10923f" o:gfxdata="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" fillcolor="#c0bcbe" stroked="f" strokeweight="1pt">
+              <v:roundrect w14:anchorId="3E72F790" id="Retângulo: Cantos Arredondados 16" o:spid="_x0000_s1038" style="position:absolute;left:0;text-align:left;margin-left:0;margin-top:12.65pt;width:335.4pt;height:28.65pt;z-index:251697152;visibility:visible;mso-wrap-style:square;mso-width-percent:0;mso-height-percent:0;mso-wrap-distance-left:9pt;mso-wrap-distance-top:0;mso-wrap-distance-right:9pt;mso-wrap-distance-bottom:0;mso-position-horizontal:center;mso-position-horizontal-relative:margin;mso-position-vertical:absolute;mso-position-vertical-relative:text;mso-width-percent:0;mso-height-percent:0;mso-width-relative:margin;mso-height-relative:margin;v-text-anchor:middle" arcsize="10923f" o:gfxdata="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" fillcolor="#c0bcbe" stroked="f" strokeweight="1pt">
                 <v:stroke joinstyle="miter"/>
                 <v:textbox>
                   <w:txbxContent>
@@ -5854,7 +5865,6 @@
           <w:lang w:val="pt-BR"/>
         </w:rPr>
       </w:pPr>
-      <w:proofErr w:type="gramStart"/>
       <w:r>
         <w:rPr>
           <w:sz w:val="24"/>
@@ -5870,16 +5880,7 @@
           <w:szCs w:val="24"/>
           <w:lang w:val="pt-BR"/>
         </w:rPr>
-        <w:t>detalhes</w:t>
-      </w:r>
-      <w:proofErr w:type="gramEnd"/>
-      <w:r>
-        <w:rPr>
-          <w:sz w:val="24"/>
-          <w:szCs w:val="24"/>
-          <w:lang w:val="pt-BR"/>
-        </w:rPr>
-        <w:t>_laudo</w:t>
+        <w:t>detalhes_laudo</w:t>
       </w:r>
       <w:proofErr w:type="spellEnd"/>
       <w:r>
@@ -5989,7 +5990,7 @@
           </mc:Choice>
           <mc:Fallback>
             <w:pict>
-              <v:roundrect w14:anchorId="690468CF" id="Retângulo: Cantos Arredondados 20" o:spid="_x0000_s1039" style="position:absolute;left:0;text-align:left;margin-left:0;margin-top:25.6pt;width:335.4pt;height:30.65pt;z-index:251699200;visibility:visible;mso-wrap-style:square;mso-width-percent:0;mso-height-percent:0;mso-wrap-distance-left:9pt;mso-wrap-distance-top:0;mso-wrap-distance-right:9pt;mso-wrap-distance-bottom:0;mso-position-horizontal:center;mso-position-horizontal-relative:margin;mso-position-vertical:absolute;mso-position-vertical-relative:text;mso-width-percent:0;mso-height-percent:0;mso-width-relative:margin;mso-height-relative:margin;v-text-anchor:middle" arcsize="10923f" o:gfxdata="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" fillcolor="#c0bcbe" stroked="f" strokeweight="1pt">
+              <v:roundrect w14:anchorId="690468CF" id="Retângulo: Cantos Arredondados 20" o:spid="_x0000_s1039" style="position:absolute;left:0;text-align:left;margin-left:0;margin-top:25.6pt;width:335.4pt;height:30.65pt;z-index:251699200;visibility:visible;mso-wrap-style:square;mso-width-percent:0;mso-height-percent:0;mso-wrap-distance-left:9pt;mso-wrap-distance-top:0;mso-wrap-distance-right:9pt;mso-wrap-distance-bottom:0;mso-position-horizontal:center;mso-position-horizontal-relative:margin;mso-position-vertical:absolute;mso-position-vertical-relative:text;mso-width-percent:0;mso-height-percent:0;mso-width-relative:margin;mso-height-relative:margin;v-text-anchor:middle" arcsize="10923f" o:gfxdata="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" fillcolor="#c0bcbe" stroked="f" strokeweight="1pt">
                 <v:stroke joinstyle="miter"/>
                 <v:textbox>
                   <w:txbxContent>
@@ -6256,7 +6257,7 @@
           </mc:Choice>
           <mc:Fallback>
             <w:pict>
-              <v:roundrect w14:anchorId="4B3B3A59" id="Retângulo: Cantos Arredondados 21" o:spid="_x0000_s1040" style="position:absolute;left:0;text-align:left;margin-left:-31.35pt;margin-top:4.4pt;width:497.25pt;height:39.75pt;z-index:251701248;visibility:visible;mso-wrap-style:square;mso-width-percent:0;mso-height-percent:0;mso-wrap-distance-left:9pt;mso-wrap-distance-top:0;mso-wrap-distance-right:9pt;mso-wrap-distance-bottom:0;mso-position-horizontal:absolute;mso-position-horizontal-relative:margin;mso-position-vertical:absolute;mso-position-vertical-relative:text;mso-width-percent:0;mso-height-percent:0;mso-width-relative:margin;mso-height-relative:margin;v-text-anchor:middle" arcsize="10923f" o:gfxdata="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" fillcolor="#c0bcbe" stroked="f" strokeweight="1pt">
+              <v:roundrect w14:anchorId="4B3B3A59" id="Retângulo: Cantos Arredondados 21" o:spid="_x0000_s1040" style="position:absolute;left:0;text-align:left;margin-left:-31.35pt;margin-top:4.4pt;width:497.25pt;height:39.75pt;z-index:251701248;visibility:visible;mso-wrap-style:square;mso-width-percent:0;mso-height-percent:0;mso-wrap-distance-left:9pt;mso-wrap-distance-top:0;mso-wrap-distance-right:9pt;mso-wrap-distance-bottom:0;mso-position-horizontal:absolute;mso-position-horizontal-relative:margin;mso-position-vertical:absolute;mso-position-vertical-relative:text;mso-width-percent:0;mso-height-percent:0;mso-width-relative:margin;mso-height-relative:margin;v-text-anchor:middle" arcsize="10923f" o:gfxdata="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" fillcolor="#c0bcbe" stroked="f" strokeweight="1pt">
                 <v:stroke joinstyle="miter"/>
                 <v:textbox>
                   <w:txbxContent>
@@ -6322,8 +6323,6 @@
         </w:rPr>
         <w:t>{%p if descricao_grupo_familiar == '1' or descricao_grupo_familiar == 'uma' or descricao_grupo_familiar == 'Uma' %}</w:t>
       </w:r>
-      <w:bookmarkStart w:id="2" w:name="_GoBack"/>
-      <w:bookmarkEnd w:id="2"/>
     </w:p>
     <w:p>
       <w:pPr>
@@ -6701,7 +6700,7 @@
           </mc:Choice>
           <mc:Fallback>
             <w:pict>
-              <v:roundrect w14:anchorId="0E722753" id="Retângulo: Cantos Arredondados 12" o:spid="_x0000_s1041" style="position:absolute;left:0;text-align:left;margin-left:0;margin-top:19.85pt;width:335.4pt;height:30.65pt;z-index:251691008;visibility:visible;mso-wrap-style:square;mso-width-percent:0;mso-height-percent:0;mso-wrap-distance-left:9pt;mso-wrap-distance-top:0;mso-wrap-distance-right:9pt;mso-wrap-distance-bottom:0;mso-position-horizontal:center;mso-position-horizontal-relative:margin;mso-position-vertical:absolute;mso-position-vertical-relative:text;mso-width-percent:0;mso-height-percent:0;mso-width-relative:margin;mso-height-relative:margin;v-text-anchor:middle" arcsize="10923f" o:gfxdata="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" fillcolor="#c0bcbe" stroked="f" strokeweight="1pt">
+              <v:roundrect w14:anchorId="0E722753" id="Retângulo: Cantos Arredondados 12" o:spid="_x0000_s1041" style="position:absolute;left:0;text-align:left;margin-left:0;margin-top:19.85pt;width:335.4pt;height:30.65pt;z-index:251691008;visibility:visible;mso-wrap-style:square;mso-width-percent:0;mso-height-percent:0;mso-wrap-distance-left:9pt;mso-wrap-distance-top:0;mso-wrap-distance-right:9pt;mso-wrap-distance-bottom:0;mso-position-horizontal:center;mso-position-horizontal-relative:margin;mso-position-vertical:absolute;mso-position-vertical-relative:text;mso-width-percent:0;mso-height-percent:0;mso-width-relative:margin;mso-height-relative:margin;v-text-anchor:middle" arcsize="10923f" o:gfxdata="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" fillcolor="#c0bcbe" stroked="f" strokeweight="1pt">
                 <v:stroke joinstyle="miter"/>
                 <v:textbox>
                   <w:txbxContent>
@@ -7157,7 +7156,7 @@
           <w:sz w:val="24"/>
           <w:szCs w:val="24"/>
         </w:rPr>
-        <w:t>6 de agosto de 2026</w:t>
+        <w:t>18 de agosto de 2026</w:t>
       </w:r>
       <w:r>
         <w:rPr>
@@ -7287,7 +7286,7 @@
 </file>
 
 <file path=word/endnotes.xml><?xml version="1.0" encoding="utf-8"?>
-<w:endnotes xmlns:wpc="http://schemas.microsoft.com/office/word/2010/wordprocessingCanvas" xmlns:cx="http://schemas.microsoft.com/office/drawing/2014/chartex" xmlns:cx1="http://schemas.microsoft.com/office/drawing/2015/9/8/chartex" xmlns:cx2="http://schemas.microsoft.com/office/drawing/2015/10/21/chartex" xmlns:cx3="http://schemas.microsoft.com/office/drawing/2016/5/9/chartex" xmlns:cx4="http://schemas.microsoft.com/office/drawing/2016/5/10/chartex" xmlns:cx5="http://schemas.microsoft.com/office/drawing/2016/5/11/chartex" xmlns:cx6="http://schemas.microsoft.com/office/drawing/2016/5/12/chartex" xmlns:cx7="http://schemas.microsoft.com/office/drawing/2016/5/13/chartex" xmlns:cx8="http://schemas.microsoft.com/office/drawing/2016/5/14/chartex" xmlns:mc="http://schemas.openxmlformats.org/markup-compatibility/2006" xmlns:aink="http://schemas.microsoft.com/office/drawing/2016/ink" xmlns:am3d="http://schemas.microsoft.com/office/drawing/2017/model3d" xmlns:o="urn:schemas-microsoft-com:office:office" xmlns:r="http://schemas.openxmlformats.org/officeDocument/2006/relationships" xmlns:m="http://schemas.openxmlformats.org/officeDocument/2006/math" xmlns:v="urn:schemas-microsoft-com:vml" xmlns:wp14="http://schemas.microsoft.com/office/word/2010/wordprocessingDrawing" xmlns:wp="http://schemas.openxmlformats.org/drawingml/2006/wordprocessingDrawing" xmlns:w10="urn:schemas-microsoft-com:office:word" xmlns:w="http://schemas.openxmlformats.org/wordprocessingml/2006/main" xmlns:w14="http://schemas.microsoft.com/office/word/2010/wordml" xmlns:w15="http://schemas.microsoft.com/office/word/2012/wordml" xmlns:w16cex="http://schemas.microsoft.com/office/word/2018/wordml/cex" xmlns:w16cid="http://schemas.microsoft.com/office/word/2016/wordml/cid" xmlns:w16="http://schemas.microsoft.com/office/word/2018/wordml" xmlns:w16se="http://schemas.microsoft.com/office/word/2015/wordml/symex" xmlns:wpg="http://schemas.microsoft.com/office/word/2010/wordprocessingGroup" xmlns:wpi="http://schemas.microsoft.com/office/word/2010/wordprocessingInk" xmlns:wne="http://schemas.microsoft.com/office/word/2006/wordml" xmlns:wps="http://schemas.microsoft.com/office/word/2010/wordprocessingShape" mc:Ignorable="w14 w15 w16se w16cid w16 w16cex wp14">
+<w:endnotes xmlns:wpc="http://schemas.microsoft.com/office/word/2010/wordprocessingCanvas" xmlns:cx="http://schemas.microsoft.com/office/drawing/2014/chartex" xmlns:cx1="http://schemas.microsoft.com/office/drawing/2015/9/8/chartex" xmlns:cx2="http://schemas.microsoft.com/office/drawing/2015/10/21/chartex" xmlns:cx3="http://schemas.microsoft.com/office/drawing/2016/5/9/chartex" xmlns:cx4="http://schemas.microsoft.com/office/drawing/2016/5/10/chartex" xmlns:cx5="http://schemas.microsoft.com/office/drawing/2016/5/11/chartex" xmlns:cx6="http://schemas.microsoft.com/office/drawing/2016/5/12/chartex" xmlns:cx7="http://schemas.microsoft.com/office/drawing/2016/5/13/chartex" xmlns:cx8="http://schemas.microsoft.com/office/drawing/2016/5/14/chartex" xmlns:mc="http://schemas.openxmlformats.org/markup-compatibility/2006" xmlns:aink="http://schemas.microsoft.com/office/drawing/2016/ink" xmlns:am3d="http://schemas.microsoft.com/office/drawing/2017/model3d" xmlns:o="urn:schemas-microsoft-com:office:office" xmlns:oel="http://schemas.microsoft.com/office/2019/extlst" xmlns:r="http://schemas.openxmlformats.org/officeDocument/2006/relationships" xmlns:m="http://schemas.openxmlformats.org/officeDocument/2006/math" xmlns:v="urn:schemas-microsoft-com:vml" xmlns:wp14="http://schemas.microsoft.com/office/word/2010/wordprocessingDrawing" xmlns:wp="http://schemas.openxmlformats.org/drawingml/2006/wordprocessingDrawing" xmlns:w10="urn:schemas-microsoft-com:office:word" xmlns:w="http://schemas.openxmlformats.org/wordprocessingml/2006/main" xmlns:w14="http://schemas.microsoft.com/office/word/2010/wordml" xmlns:w15="http://schemas.microsoft.com/office/word/2012/wordml" xmlns:w16cex="http://schemas.microsoft.com/office/word/2018/wordml/cex" xmlns:w16cid="http://schemas.microsoft.com/office/word/2016/wordml/cid" xmlns:w16="http://schemas.microsoft.com/office/word/2018/wordml" xmlns:w16du="http://schemas.microsoft.com/office/word/2023/wordml/word16du" xmlns:w16sdtdh="http://schemas.microsoft.com/office/word/2020/wordml/sdtdatahash" xmlns:w16sdtfl="http://schemas.microsoft.com/office/word/2024/wordml/sdtformatlock" xmlns:w16se="http://schemas.microsoft.com/office/word/2015/wordml/symex" xmlns:wpg="http://schemas.microsoft.com/office/word/2010/wordprocessingGroup" xmlns:wpi="http://schemas.microsoft.com/office/word/2010/wordprocessingInk" xmlns:wne="http://schemas.microsoft.com/office/word/2006/wordml" xmlns:wps="http://schemas.microsoft.com/office/word/2010/wordprocessingShape" mc:Ignorable="w14 w15 w16se w16cid w16 w16cex w16sdtdh w16sdtfl w16du wp14">
   <w:endnote w:type="separator" w:id="-1">
     <w:p>
       <w:r>
@@ -7306,7 +7305,7 @@
 </file>
 
 <file path=word/footer1.xml><?xml version="1.0" encoding="utf-8"?>
-<w:ftr xmlns:wpc="http://schemas.microsoft.com/office/word/2010/wordprocessingCanvas" xmlns:cx="http://schemas.microsoft.com/office/drawing/2014/chartex" xmlns:cx1="http://schemas.microsoft.com/office/drawing/2015/9/8/chartex" xmlns:cx2="http://schemas.microsoft.com/office/drawing/2015/10/21/chartex" xmlns:cx3="http://schemas.microsoft.com/office/drawing/2016/5/9/chartex" xmlns:cx4="http://schemas.microsoft.com/office/drawing/2016/5/10/chartex" xmlns:cx5="http://schemas.microsoft.com/office/drawing/2016/5/11/chartex" xmlns:cx6="http://schemas.microsoft.com/office/drawing/2016/5/12/chartex" xmlns:cx7="http://schemas.microsoft.com/office/drawing/2016/5/13/chartex" xmlns:cx8="http://schemas.microsoft.com/office/drawing/2016/5/14/chartex" xmlns:mc="http://schemas.openxmlformats.org/markup-compatibility/2006" xmlns:aink="http://schemas.microsoft.com/office/drawing/2016/ink" xmlns:am3d="http://schemas.microsoft.com/office/drawing/2017/model3d" xmlns:o="urn:schemas-microsoft-com:office:office" xmlns:r="http://schemas.openxmlformats.org/officeDocument/2006/relationships" xmlns:m="http://schemas.openxmlformats.org/officeDocument/2006/math" xmlns:v="urn:schemas-microsoft-com:vml" xmlns:wp14="http://schemas.microsoft.com/office/word/2010/wordprocessingDrawing" xmlns:wp="http://schemas.openxmlformats.org/drawingml/2006/wordprocessingDrawing" xmlns:w10="urn:schemas-microsoft-com:office:word" xmlns:w="http://schemas.openxmlformats.org/wordprocessingml/2006/main" xmlns:w14="http://schemas.microsoft.com/office/word/2010/wordml" xmlns:w15="http://schemas.microsoft.com/office/word/2012/wordml" xmlns:w16cex="http://schemas.microsoft.com/office/word/2018/wordml/cex" xmlns:w16cid="http://schemas.microsoft.com/office/word/2016/wordml/cid" xmlns:w16="http://schemas.microsoft.com/office/word/2018/wordml" xmlns:w16se="http://schemas.microsoft.com/office/word/2015/wordml/symex" xmlns:wpg="http://schemas.microsoft.com/office/word/2010/wordprocessingGroup" xmlns:wpi="http://schemas.microsoft.com/office/word/2010/wordprocessingInk" xmlns:wne="http://schemas.microsoft.com/office/word/2006/wordml" xmlns:wps="http://schemas.microsoft.com/office/word/2010/wordprocessingShape" mc:Ignorable="w14 w15 w16se w16cid w16 w16cex wp14">
+<w:ftr xmlns:wpc="http://schemas.microsoft.com/office/word/2010/wordprocessingCanvas" xmlns:cx="http://schemas.microsoft.com/office/drawing/2014/chartex" xmlns:cx1="http://schemas.microsoft.com/office/drawing/2015/9/8/chartex" xmlns:cx2="http://schemas.microsoft.com/office/drawing/2015/10/21/chartex" xmlns:cx3="http://schemas.microsoft.com/office/drawing/2016/5/9/chartex" xmlns:cx4="http://schemas.microsoft.com/office/drawing/2016/5/10/chartex" xmlns:cx5="http://schemas.microsoft.com/office/drawing/2016/5/11/chartex" xmlns:cx6="http://schemas.microsoft.com/office/drawing/2016/5/12/chartex" xmlns:cx7="http://schemas.microsoft.com/office/drawing/2016/5/13/chartex" xmlns:cx8="http://schemas.microsoft.com/office/drawing/2016/5/14/chartex" xmlns:mc="http://schemas.openxmlformats.org/markup-compatibility/2006" xmlns:aink="http://schemas.microsoft.com/office/drawing/2016/ink" xmlns:am3d="http://schemas.microsoft.com/office/drawing/2017/model3d" xmlns:o="urn:schemas-microsoft-com:office:office" xmlns:oel="http://schemas.microsoft.com/office/2019/extlst" xmlns:r="http://schemas.openxmlformats.org/officeDocument/2006/relationships" xmlns:m="http://schemas.openxmlformats.org/officeDocument/2006/math" xmlns:v="urn:schemas-microsoft-com:vml" xmlns:wp14="http://schemas.microsoft.com/office/word/2010/wordprocessingDrawing" xmlns:wp="http://schemas.openxmlformats.org/drawingml/2006/wordprocessingDrawing" xmlns:w10="urn:schemas-microsoft-com:office:word" xmlns:w="http://schemas.openxmlformats.org/wordprocessingml/2006/main" xmlns:w14="http://schemas.microsoft.com/office/word/2010/wordml" xmlns:w15="http://schemas.microsoft.com/office/word/2012/wordml" xmlns:w16cex="http://schemas.microsoft.com/office/word/2018/wordml/cex" xmlns:w16cid="http://schemas.microsoft.com/office/word/2016/wordml/cid" xmlns:w16="http://schemas.microsoft.com/office/word/2018/wordml" xmlns:w16du="http://schemas.microsoft.com/office/word/2023/wordml/word16du" xmlns:w16sdtdh="http://schemas.microsoft.com/office/word/2020/wordml/sdtdatahash" xmlns:w16sdtfl="http://schemas.microsoft.com/office/word/2024/wordml/sdtformatlock" xmlns:w16se="http://schemas.microsoft.com/office/word/2015/wordml/symex" xmlns:wpg="http://schemas.microsoft.com/office/word/2010/wordprocessingGroup" xmlns:wpi="http://schemas.microsoft.com/office/word/2010/wordprocessingInk" xmlns:wne="http://schemas.microsoft.com/office/word/2006/wordml" xmlns:wps="http://schemas.microsoft.com/office/word/2010/wordprocessingShape" mc:Ignorable="w14 w15 w16se w16cid w16 w16cex w16sdtdh w16sdtfl w16du wp14">
   <w:p>
     <w:pPr>
       <w:pStyle w:val="Corpodetexto"/>
@@ -7404,7 +7403,7 @@
             </wp:anchor>
           </w:drawing>
         </mc:Choice>
-        <mc:Fallback xmlns:w16sdtfl="http://schemas.microsoft.com/office/word/2024/wordml/sdtformatlock" xmlns:w16sdtdh="http://schemas.microsoft.com/office/word/2020/wordml/sdtdatahash" xmlns:w16du="http://schemas.microsoft.com/office/word/2023/wordml/word16du" xmlns:oel="http://schemas.microsoft.com/office/2019/extlst">
+        <mc:Fallback>
           <w:pict>
             <v:shape w14:anchorId="3BCF6105" id="Forma Livre: Forma 13" o:spid="_x0000_s1026" style="position:absolute;margin-left:97.1pt;margin-top:24.7pt;width:370.9pt;height:.1pt;z-index:-251653120;visibility:visible;mso-wrap-style:square;mso-width-percent:0;mso-height-percent:0;mso-wrap-distance-left:0;mso-wrap-distance-top:0;mso-wrap-distance-right:0;mso-wrap-distance-bottom:0;mso-position-horizontal:absolute;mso-position-horizontal-relative:page;mso-position-vertical:absolute;mso-position-vertical-relative:text;mso-width-percent:0;mso-height-percent:0;mso-width-relative:page;mso-height-relative:page;v-text-anchor:top" coordsize="4710430,1270" o:gfxdata="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" path="m,l4709804,e" filled="f" strokeweight=".40283mm">
               <v:path arrowok="t" o:connecttype="custom" o:connectlocs="0,0;4709804,0" o:connectangles="0,0"/>
@@ -7674,8 +7673,8 @@
 </file>
 
 <file path=word/footer2.xml><?xml version="1.0" encoding="utf-8"?>
-<w:ftr xmlns:wpc="http://schemas.microsoft.com/office/word/2010/wordprocessingCanvas" xmlns:cx="http://schemas.microsoft.com/office/drawing/2014/chartex" xmlns:cx1="http://schemas.microsoft.com/office/drawing/2015/9/8/chartex" xmlns:cx2="http://schemas.microsoft.com/office/drawing/2015/10/21/chartex" xmlns:cx3="http://schemas.microsoft.com/office/drawing/2016/5/9/chartex" xmlns:cx4="http://schemas.microsoft.com/office/drawing/2016/5/10/chartex" xmlns:cx5="http://schemas.microsoft.com/office/drawing/2016/5/11/chartex" xmlns:cx6="http://schemas.microsoft.com/office/drawing/2016/5/12/chartex" xmlns:cx7="http://schemas.microsoft.com/office/drawing/2016/5/13/chartex" xmlns:cx8="http://schemas.microsoft.com/office/drawing/2016/5/14/chartex" xmlns:mc="http://schemas.openxmlformats.org/markup-compatibility/2006" xmlns:aink="http://schemas.microsoft.com/office/drawing/2016/ink" xmlns:am3d="http://schemas.microsoft.com/office/drawing/2017/model3d" xmlns:o="urn:schemas-microsoft-com:office:office" xmlns:r="http://schemas.openxmlformats.org/officeDocument/2006/relationships" xmlns:m="http://schemas.openxmlformats.org/officeDocument/2006/math" xmlns:v="urn:schemas-microsoft-com:vml" xmlns:wp14="http://schemas.microsoft.com/office/word/2010/wordprocessingDrawing" xmlns:wp="http://schemas.openxmlformats.org/drawingml/2006/wordprocessingDrawing" xmlns:w10="urn:schemas-microsoft-com:office:word" xmlns:w="http://schemas.openxmlformats.org/wordprocessingml/2006/main" xmlns:w14="http://schemas.microsoft.com/office/word/2010/wordml" xmlns:w15="http://schemas.microsoft.com/office/word/2012/wordml" xmlns:w16cex="http://schemas.microsoft.com/office/word/2018/wordml/cex" xmlns:w16cid="http://schemas.microsoft.com/office/word/2016/wordml/cid" xmlns:w16="http://schemas.microsoft.com/office/word/2018/wordml" xmlns:w16se="http://schemas.microsoft.com/office/word/2015/wordml/symex" xmlns:wpg="http://schemas.microsoft.com/office/word/2010/wordprocessingGroup" xmlns:wpi="http://schemas.microsoft.com/office/word/2010/wordprocessingInk" xmlns:wne="http://schemas.microsoft.com/office/word/2006/wordml" xmlns:wps="http://schemas.microsoft.com/office/word/2010/wordprocessingShape" mc:Ignorable="w14 w15 w16se w16cid w16 w16cex wp14">
-  <w:bookmarkStart w:id="3" w:name="_Hlk191116999"/>
+<w:ftr xmlns:wpc="http://schemas.microsoft.com/office/word/2010/wordprocessingCanvas" xmlns:cx="http://schemas.microsoft.com/office/drawing/2014/chartex" xmlns:cx1="http://schemas.microsoft.com/office/drawing/2015/9/8/chartex" xmlns:cx2="http://schemas.microsoft.com/office/drawing/2015/10/21/chartex" xmlns:cx3="http://schemas.microsoft.com/office/drawing/2016/5/9/chartex" xmlns:cx4="http://schemas.microsoft.com/office/drawing/2016/5/10/chartex" xmlns:cx5="http://schemas.microsoft.com/office/drawing/2016/5/11/chartex" xmlns:cx6="http://schemas.microsoft.com/office/drawing/2016/5/12/chartex" xmlns:cx7="http://schemas.microsoft.com/office/drawing/2016/5/13/chartex" xmlns:cx8="http://schemas.microsoft.com/office/drawing/2016/5/14/chartex" xmlns:mc="http://schemas.openxmlformats.org/markup-compatibility/2006" xmlns:aink="http://schemas.microsoft.com/office/drawing/2016/ink" xmlns:am3d="http://schemas.microsoft.com/office/drawing/2017/model3d" xmlns:o="urn:schemas-microsoft-com:office:office" xmlns:oel="http://schemas.microsoft.com/office/2019/extlst" xmlns:r="http://schemas.openxmlformats.org/officeDocument/2006/relationships" xmlns:m="http://schemas.openxmlformats.org/officeDocument/2006/math" xmlns:v="urn:schemas-microsoft-com:vml" xmlns:wp14="http://schemas.microsoft.com/office/word/2010/wordprocessingDrawing" xmlns:wp="http://schemas.openxmlformats.org/drawingml/2006/wordprocessingDrawing" xmlns:w10="urn:schemas-microsoft-com:office:word" xmlns:w="http://schemas.openxmlformats.org/wordprocessingml/2006/main" xmlns:w14="http://schemas.microsoft.com/office/word/2010/wordml" xmlns:w15="http://schemas.microsoft.com/office/word/2012/wordml" xmlns:w16cex="http://schemas.microsoft.com/office/word/2018/wordml/cex" xmlns:w16cid="http://schemas.microsoft.com/office/word/2016/wordml/cid" xmlns:w16="http://schemas.microsoft.com/office/word/2018/wordml" xmlns:w16du="http://schemas.microsoft.com/office/word/2023/wordml/word16du" xmlns:w16sdtdh="http://schemas.microsoft.com/office/word/2020/wordml/sdtdatahash" xmlns:w16sdtfl="http://schemas.microsoft.com/office/word/2024/wordml/sdtformatlock" xmlns:w16se="http://schemas.microsoft.com/office/word/2015/wordml/symex" xmlns:wpg="http://schemas.microsoft.com/office/word/2010/wordprocessingGroup" xmlns:wpi="http://schemas.microsoft.com/office/word/2010/wordprocessingInk" xmlns:wne="http://schemas.microsoft.com/office/word/2006/wordml" xmlns:wps="http://schemas.microsoft.com/office/word/2010/wordprocessingShape" mc:Ignorable="w14 w15 w16se w16cid w16 w16cex w16sdtdh w16sdtfl w16du wp14">
+  <w:bookmarkStart w:id="2" w:name="_Hlk191116999"/>
   <w:p>
     <w:pPr>
       <w:pStyle w:val="Corpodetexto"/>
@@ -7773,7 +7772,7 @@
             </wp:anchor>
           </w:drawing>
         </mc:Choice>
-        <mc:Fallback xmlns:w16sdtfl="http://schemas.microsoft.com/office/word/2024/wordml/sdtformatlock" xmlns:w16sdtdh="http://schemas.microsoft.com/office/word/2020/wordml/sdtdatahash" xmlns:w16du="http://schemas.microsoft.com/office/word/2023/wordml/word16du" xmlns:oel="http://schemas.microsoft.com/office/2019/extlst">
+        <mc:Fallback>
           <w:pict>
             <v:shape w14:anchorId="734A0437" id="Forma Livre: Forma 3" o:spid="_x0000_s1026" style="position:absolute;margin-left:97.1pt;margin-top:24.7pt;width:370.9pt;height:.1pt;z-index:-251655168;visibility:visible;mso-wrap-style:square;mso-width-percent:0;mso-height-percent:0;mso-wrap-distance-left:0;mso-wrap-distance-top:0;mso-wrap-distance-right:0;mso-wrap-distance-bottom:0;mso-position-horizontal:absolute;mso-position-horizontal-relative:page;mso-position-vertical:absolute;mso-position-vertical-relative:text;mso-width-percent:0;mso-height-percent:0;mso-width-relative:page;mso-height-relative:page;v-text-anchor:top" coordsize="4710430,1270" o:gfxdata="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" path="m,l4709804,e" filled="f" strokeweight=".40283mm">
               <v:path arrowok="t" o:connecttype="custom" o:connectlocs="0,0;4709804,0" o:connectangles="0,0"/>
@@ -8034,7 +8033,7 @@
       </w:r>
     </w:hyperlink>
   </w:p>
-  <w:bookmarkEnd w:id="3"/>
+  <w:bookmarkEnd w:id="2"/>
   <w:p>
     <w:pPr>
       <w:pStyle w:val="Rodap"/>
@@ -8044,7 +8043,7 @@
 </file>
 
 <file path=word/footnotes.xml><?xml version="1.0" encoding="utf-8"?>
-<w:footnotes xmlns:wpc="http://schemas.microsoft.com/office/word/2010/wordprocessingCanvas" xmlns:cx="http://schemas.microsoft.com/office/drawing/2014/chartex" xmlns:cx1="http://schemas.microsoft.com/office/drawing/2015/9/8/chartex" xmlns:cx2="http://schemas.microsoft.com/office/drawing/2015/10/21/chartex" xmlns:cx3="http://schemas.microsoft.com/office/drawing/2016/5/9/chartex" xmlns:cx4="http://schemas.microsoft.com/office/drawing/2016/5/10/chartex" xmlns:cx5="http://schemas.microsoft.com/office/drawing/2016/5/11/chartex" xmlns:cx6="http://schemas.microsoft.com/office/drawing/2016/5/12/chartex" xmlns:cx7="http://schemas.microsoft.com/office/drawing/2016/5/13/chartex" xmlns:cx8="http://schemas.microsoft.com/office/drawing/2016/5/14/chartex" xmlns:mc="http://schemas.openxmlformats.org/markup-compatibility/2006" xmlns:aink="http://schemas.microsoft.com/office/drawing/2016/ink" xmlns:am3d="http://schemas.microsoft.com/office/drawing/2017/model3d" xmlns:o="urn:schemas-microsoft-com:office:office" xmlns:r="http://schemas.openxmlformats.org/officeDocument/2006/relationships" xmlns:m="http://schemas.openxmlformats.org/officeDocument/2006/math" xmlns:v="urn:schemas-microsoft-com:vml" xmlns:wp14="http://schemas.microsoft.com/office/word/2010/wordprocessingDrawing" xmlns:wp="http://schemas.openxmlformats.org/drawingml/2006/wordprocessingDrawing" xmlns:w10="urn:schemas-microsoft-com:office:word" xmlns:w="http://schemas.openxmlformats.org/wordprocessingml/2006/main" xmlns:w14="http://schemas.microsoft.com/office/word/2010/wordml" xmlns:w15="http://schemas.microsoft.com/office/word/2012/wordml" xmlns:w16cex="http://schemas.microsoft.com/office/word/2018/wordml/cex" xmlns:w16cid="http://schemas.microsoft.com/office/word/2016/wordml/cid" xmlns:w16="http://schemas.microsoft.com/office/word/2018/wordml" xmlns:w16se="http://schemas.microsoft.com/office/word/2015/wordml/symex" xmlns:wpg="http://schemas.microsoft.com/office/word/2010/wordprocessingGroup" xmlns:wpi="http://schemas.microsoft.com/office/word/2010/wordprocessingInk" xmlns:wne="http://schemas.microsoft.com/office/word/2006/wordml" xmlns:wps="http://schemas.microsoft.com/office/word/2010/wordprocessingShape" mc:Ignorable="w14 w15 w16se w16cid w16 w16cex wp14">
+<w:footnotes xmlns:wpc="http://schemas.microsoft.com/office/word/2010/wordprocessingCanvas" xmlns:cx="http://schemas.microsoft.com/office/drawing/2014/chartex" xmlns:cx1="http://schemas.microsoft.com/office/drawing/2015/9/8/chartex" xmlns:cx2="http://schemas.microsoft.com/office/drawing/2015/10/21/chartex" xmlns:cx3="http://schemas.microsoft.com/office/drawing/2016/5/9/chartex" xmlns:cx4="http://schemas.microsoft.com/office/drawing/2016/5/10/chartex" xmlns:cx5="http://schemas.microsoft.com/office/drawing/2016/5/11/chartex" xmlns:cx6="http://schemas.microsoft.com/office/drawing/2016/5/12/chartex" xmlns:cx7="http://schemas.microsoft.com/office/drawing/2016/5/13/chartex" xmlns:cx8="http://schemas.microsoft.com/office/drawing/2016/5/14/chartex" xmlns:mc="http://schemas.openxmlformats.org/markup-compatibility/2006" xmlns:aink="http://schemas.microsoft.com/office/drawing/2016/ink" xmlns:am3d="http://schemas.microsoft.com/office/drawing/2017/model3d" xmlns:o="urn:schemas-microsoft-com:office:office" xmlns:oel="http://schemas.microsoft.com/office/2019/extlst" xmlns:r="http://schemas.openxmlformats.org/officeDocument/2006/relationships" xmlns:m="http://schemas.openxmlformats.org/officeDocument/2006/math" xmlns:v="urn:schemas-microsoft-com:vml" xmlns:wp14="http://schemas.microsoft.com/office/word/2010/wordprocessingDrawing" xmlns:wp="http://schemas.openxmlformats.org/drawingml/2006/wordprocessingDrawing" xmlns:w10="urn:schemas-microsoft-com:office:word" xmlns:w="http://schemas.openxmlformats.org/wordprocessingml/2006/main" xmlns:w14="http://schemas.microsoft.com/office/word/2010/wordml" xmlns:w15="http://schemas.microsoft.com/office/word/2012/wordml" xmlns:w16cex="http://schemas.microsoft.com/office/word/2018/wordml/cex" xmlns:w16cid="http://schemas.microsoft.com/office/word/2016/wordml/cid" xmlns:w16="http://schemas.microsoft.com/office/word/2018/wordml" xmlns:w16du="http://schemas.microsoft.com/office/word/2023/wordml/word16du" xmlns:w16sdtdh="http://schemas.microsoft.com/office/word/2020/wordml/sdtdatahash" xmlns:w16sdtfl="http://schemas.microsoft.com/office/word/2024/wordml/sdtformatlock" xmlns:w16se="http://schemas.microsoft.com/office/word/2015/wordml/symex" xmlns:wpg="http://schemas.microsoft.com/office/word/2010/wordprocessingGroup" xmlns:wpi="http://schemas.microsoft.com/office/word/2010/wordprocessingInk" xmlns:wne="http://schemas.microsoft.com/office/word/2006/wordml" xmlns:wps="http://schemas.microsoft.com/office/word/2010/wordprocessingShape" mc:Ignorable="w14 w15 w16se w16cid w16 w16cex w16sdtdh w16sdtfl w16du wp14">
   <w:footnote w:type="separator" w:id="-1">
     <w:p>
       <w:r>
@@ -8063,7 +8062,7 @@
 </file>
 
 <file path=word/header1.xml><?xml version="1.0" encoding="utf-8"?>
-<w:hdr xmlns:wpc="http://schemas.microsoft.com/office/word/2010/wordprocessingCanvas" xmlns:cx="http://schemas.microsoft.com/office/drawing/2014/chartex" xmlns:cx1="http://schemas.microsoft.com/office/drawing/2015/9/8/chartex" xmlns:cx2="http://schemas.microsoft.com/office/drawing/2015/10/21/chartex" xmlns:cx3="http://schemas.microsoft.com/office/drawing/2016/5/9/chartex" xmlns:cx4="http://schemas.microsoft.com/office/drawing/2016/5/10/chartex" xmlns:cx5="http://schemas.microsoft.com/office/drawing/2016/5/11/chartex" xmlns:cx6="http://schemas.microsoft.com/office/drawing/2016/5/12/chartex" xmlns:cx7="http://schemas.microsoft.com/office/drawing/2016/5/13/chartex" xmlns:cx8="http://schemas.microsoft.com/office/drawing/2016/5/14/chartex" xmlns:mc="http://schemas.openxmlformats.org/markup-compatibility/2006" xmlns:aink="http://schemas.microsoft.com/office/drawing/2016/ink" xmlns:am3d="http://schemas.microsoft.com/office/drawing/2017/model3d" xmlns:o="urn:schemas-microsoft-com:office:office" xmlns:r="http://schemas.openxmlformats.org/officeDocument/2006/relationships" xmlns:m="http://schemas.openxmlformats.org/officeDocument/2006/math" xmlns:v="urn:schemas-microsoft-com:vml" xmlns:wp14="http://schemas.microsoft.com/office/word/2010/wordprocessingDrawing" xmlns:wp="http://schemas.openxmlformats.org/drawingml/2006/wordprocessingDrawing" xmlns:w10="urn:schemas-microsoft-com:office:word" xmlns:w="http://schemas.openxmlformats.org/wordprocessingml/2006/main" xmlns:w14="http://schemas.microsoft.com/office/word/2010/wordml" xmlns:w15="http://schemas.microsoft.com/office/word/2012/wordml" xmlns:w16cex="http://schemas.microsoft.com/office/word/2018/wordml/cex" xmlns:w16cid="http://schemas.microsoft.com/office/word/2016/wordml/cid" xmlns:w16="http://schemas.microsoft.com/office/word/2018/wordml" xmlns:w16se="http://schemas.microsoft.com/office/word/2015/wordml/symex" xmlns:wpg="http://schemas.microsoft.com/office/word/2010/wordprocessingGroup" xmlns:wpi="http://schemas.microsoft.com/office/word/2010/wordprocessingInk" xmlns:wne="http://schemas.microsoft.com/office/word/2006/wordml" xmlns:wps="http://schemas.microsoft.com/office/word/2010/wordprocessingShape" mc:Ignorable="w14 w15 w16se w16cid w16 w16cex wp14">
+<w:hdr xmlns:wpc="http://schemas.microsoft.com/office/word/2010/wordprocessingCanvas" xmlns:cx="http://schemas.microsoft.com/office/drawing/2014/chartex" xmlns:cx1="http://schemas.microsoft.com/office/drawing/2015/9/8/chartex" xmlns:cx2="http://schemas.microsoft.com/office/drawing/2015/10/21/chartex" xmlns:cx3="http://schemas.microsoft.com/office/drawing/2016/5/9/chartex" xmlns:cx4="http://schemas.microsoft.com/office/drawing/2016/5/10/chartex" xmlns:cx5="http://schemas.microsoft.com/office/drawing/2016/5/11/chartex" xmlns:cx6="http://schemas.microsoft.com/office/drawing/2016/5/12/chartex" xmlns:cx7="http://schemas.microsoft.com/office/drawing/2016/5/13/chartex" xmlns:cx8="http://schemas.microsoft.com/office/drawing/2016/5/14/chartex" xmlns:mc="http://schemas.openxmlformats.org/markup-compatibility/2006" xmlns:aink="http://schemas.microsoft.com/office/drawing/2016/ink" xmlns:am3d="http://schemas.microsoft.com/office/drawing/2017/model3d" xmlns:o="urn:schemas-microsoft-com:office:office" xmlns:oel="http://schemas.microsoft.com/office/2019/extlst" xmlns:r="http://schemas.openxmlformats.org/officeDocument/2006/relationships" xmlns:m="http://schemas.openxmlformats.org/officeDocument/2006/math" xmlns:v="urn:schemas-microsoft-com:vml" xmlns:wp14="http://schemas.microsoft.com/office/word/2010/wordprocessingDrawing" xmlns:wp="http://schemas.openxmlformats.org/drawingml/2006/wordprocessingDrawing" xmlns:w10="urn:schemas-microsoft-com:office:word" xmlns:w="http://schemas.openxmlformats.org/wordprocessingml/2006/main" xmlns:w14="http://schemas.microsoft.com/office/word/2010/wordml" xmlns:w15="http://schemas.microsoft.com/office/word/2012/wordml" xmlns:w16cex="http://schemas.microsoft.com/office/word/2018/wordml/cex" xmlns:w16cid="http://schemas.microsoft.com/office/word/2016/wordml/cid" xmlns:w16="http://schemas.microsoft.com/office/word/2018/wordml" xmlns:w16du="http://schemas.microsoft.com/office/word/2023/wordml/word16du" xmlns:w16sdtdh="http://schemas.microsoft.com/office/word/2020/wordml/sdtdatahash" xmlns:w16sdtfl="http://schemas.microsoft.com/office/word/2024/wordml/sdtformatlock" xmlns:w16se="http://schemas.microsoft.com/office/word/2015/wordml/symex" xmlns:wpg="http://schemas.microsoft.com/office/word/2010/wordprocessingGroup" xmlns:wpi="http://schemas.microsoft.com/office/word/2010/wordprocessingInk" xmlns:wne="http://schemas.microsoft.com/office/word/2006/wordml" xmlns:wps="http://schemas.microsoft.com/office/word/2010/wordprocessingShape" mc:Ignorable="w14 w15 w16se w16cid w16 w16cex w16sdtdh w16sdtfl w16du wp14">
   <w:p>
     <w:pPr>
       <w:pStyle w:val="Corpodetexto"/>
@@ -8077,7 +8076,7 @@
 </file>
 
 <file path=word/header2.xml><?xml version="1.0" encoding="utf-8"?>
-<w:hdr xmlns:wpc="http://schemas.microsoft.com/office/word/2010/wordprocessingCanvas" xmlns:cx="http://schemas.microsoft.com/office/drawing/2014/chartex" xmlns:cx1="http://schemas.microsoft.com/office/drawing/2015/9/8/chartex" xmlns:cx2="http://schemas.microsoft.com/office/drawing/2015/10/21/chartex" xmlns:cx3="http://schemas.microsoft.com/office/drawing/2016/5/9/chartex" xmlns:cx4="http://schemas.microsoft.com/office/drawing/2016/5/10/chartex" xmlns:cx5="http://schemas.microsoft.com/office/drawing/2016/5/11/chartex" xmlns:cx6="http://schemas.microsoft.com/office/drawing/2016/5/12/chartex" xmlns:cx7="http://schemas.microsoft.com/office/drawing/2016/5/13/chartex" xmlns:cx8="http://schemas.microsoft.com/office/drawing/2016/5/14/chartex" xmlns:mc="http://schemas.openxmlformats.org/markup-compatibility/2006" xmlns:aink="http://schemas.microsoft.com/office/drawing/2016/ink" xmlns:am3d="http://schemas.microsoft.com/office/drawing/2017/model3d" xmlns:o="urn:schemas-microsoft-com:office:office" xmlns:r="http://schemas.openxmlformats.org/officeDocument/2006/relationships" xmlns:m="http://schemas.openxmlformats.org/officeDocument/2006/math" xmlns:v="urn:schemas-microsoft-com:vml" xmlns:wp14="http://schemas.microsoft.com/office/word/2010/wordprocessingDrawing" xmlns:wp="http://schemas.openxmlformats.org/drawingml/2006/wordprocessingDrawing" xmlns:w10="urn:schemas-microsoft-com:office:word" xmlns:w="http://schemas.openxmlformats.org/wordprocessingml/2006/main" xmlns:w14="http://schemas.microsoft.com/office/word/2010/wordml" xmlns:w15="http://schemas.microsoft.com/office/word/2012/wordml" xmlns:w16cex="http://schemas.microsoft.com/office/word/2018/wordml/cex" xmlns:w16cid="http://schemas.microsoft.com/office/word/2016/wordml/cid" xmlns:w16="http://schemas.microsoft.com/office/word/2018/wordml" xmlns:w16se="http://schemas.microsoft.com/office/word/2015/wordml/symex" xmlns:wpg="http://schemas.microsoft.com/office/word/2010/wordprocessingGroup" xmlns:wpi="http://schemas.microsoft.com/office/word/2010/wordprocessingInk" xmlns:wne="http://schemas.microsoft.com/office/word/2006/wordml" xmlns:wps="http://schemas.microsoft.com/office/word/2010/wordprocessingShape" mc:Ignorable="w14 w15 w16se w16cid w16 w16cex wp14">
+<w:hdr xmlns:wpc="http://schemas.microsoft.com/office/word/2010/wordprocessingCanvas" xmlns:cx="http://schemas.microsoft.com/office/drawing/2014/chartex" xmlns:cx1="http://schemas.microsoft.com/office/drawing/2015/9/8/chartex" xmlns:cx2="http://schemas.microsoft.com/office/drawing/2015/10/21/chartex" xmlns:cx3="http://schemas.microsoft.com/office/drawing/2016/5/9/chartex" xmlns:cx4="http://schemas.microsoft.com/office/drawing/2016/5/10/chartex" xmlns:cx5="http://schemas.microsoft.com/office/drawing/2016/5/11/chartex" xmlns:cx6="http://schemas.microsoft.com/office/drawing/2016/5/12/chartex" xmlns:cx7="http://schemas.microsoft.com/office/drawing/2016/5/13/chartex" xmlns:cx8="http://schemas.microsoft.com/office/drawing/2016/5/14/chartex" xmlns:mc="http://schemas.openxmlformats.org/markup-compatibility/2006" xmlns:aink="http://schemas.microsoft.com/office/drawing/2016/ink" xmlns:am3d="http://schemas.microsoft.com/office/drawing/2017/model3d" xmlns:o="urn:schemas-microsoft-com:office:office" xmlns:oel="http://schemas.microsoft.com/office/2019/extlst" xmlns:r="http://schemas.openxmlformats.org/officeDocument/2006/relationships" xmlns:m="http://schemas.openxmlformats.org/officeDocument/2006/math" xmlns:v="urn:schemas-microsoft-com:vml" xmlns:wp14="http://schemas.microsoft.com/office/word/2010/wordprocessingDrawing" xmlns:wp="http://schemas.openxmlformats.org/drawingml/2006/wordprocessingDrawing" xmlns:w10="urn:schemas-microsoft-com:office:word" xmlns:w="http://schemas.openxmlformats.org/wordprocessingml/2006/main" xmlns:w14="http://schemas.microsoft.com/office/word/2010/wordml" xmlns:w15="http://schemas.microsoft.com/office/word/2012/wordml" xmlns:w16cex="http://schemas.microsoft.com/office/word/2018/wordml/cex" xmlns:w16cid="http://schemas.microsoft.com/office/word/2016/wordml/cid" xmlns:w16="http://schemas.microsoft.com/office/word/2018/wordml" xmlns:w16du="http://schemas.microsoft.com/office/word/2023/wordml/word16du" xmlns:w16sdtdh="http://schemas.microsoft.com/office/word/2020/wordml/sdtdatahash" xmlns:w16sdtfl="http://schemas.microsoft.com/office/word/2024/wordml/sdtformatlock" xmlns:w16se="http://schemas.microsoft.com/office/word/2015/wordml/symex" xmlns:wpg="http://schemas.microsoft.com/office/word/2010/wordprocessingGroup" xmlns:wpi="http://schemas.microsoft.com/office/word/2010/wordprocessingInk" xmlns:wne="http://schemas.microsoft.com/office/word/2006/wordml" xmlns:wps="http://schemas.microsoft.com/office/word/2010/wordprocessingShape" mc:Ignorable="w14 w15 w16se w16cid w16 w16cex w16sdtdh w16sdtfl w16du wp14">
   <w:p>
     <w:pPr>
       <w:pStyle w:val="Cabealho"/>
@@ -8151,7 +8150,7 @@
 </file>
 
 <file path=word/header3.xml><?xml version="1.0" encoding="utf-8"?>
-<w:hdr xmlns:wpc="http://schemas.microsoft.com/office/word/2010/wordprocessingCanvas" xmlns:cx="http://schemas.microsoft.com/office/drawing/2014/chartex" xmlns:cx1="http://schemas.microsoft.com/office/drawing/2015/9/8/chartex" xmlns:cx2="http://schemas.microsoft.com/office/drawing/2015/10/21/chartex" xmlns:cx3="http://schemas.microsoft.com/office/drawing/2016/5/9/chartex" xmlns:cx4="http://schemas.microsoft.com/office/drawing/2016/5/10/chartex" xmlns:cx5="http://schemas.microsoft.com/office/drawing/2016/5/11/chartex" xmlns:cx6="http://schemas.microsoft.com/office/drawing/2016/5/12/chartex" xmlns:cx7="http://schemas.microsoft.com/office/drawing/2016/5/13/chartex" xmlns:cx8="http://schemas.microsoft.com/office/drawing/2016/5/14/chartex" xmlns:mc="http://schemas.openxmlformats.org/markup-compatibility/2006" xmlns:aink="http://schemas.microsoft.com/office/drawing/2016/ink" xmlns:am3d="http://schemas.microsoft.com/office/drawing/2017/model3d" xmlns:o="urn:schemas-microsoft-com:office:office" xmlns:r="http://schemas.openxmlformats.org/officeDocument/2006/relationships" xmlns:m="http://schemas.openxmlformats.org/officeDocument/2006/math" xmlns:v="urn:schemas-microsoft-com:vml" xmlns:wp14="http://schemas.microsoft.com/office/word/2010/wordprocessingDrawing" xmlns:wp="http://schemas.openxmlformats.org/drawingml/2006/wordprocessingDrawing" xmlns:w10="urn:schemas-microsoft-com:office:word" xmlns:w="http://schemas.openxmlformats.org/wordprocessingml/2006/main" xmlns:w14="http://schemas.microsoft.com/office/word/2010/wordml" xmlns:w15="http://schemas.microsoft.com/office/word/2012/wordml" xmlns:w16cex="http://schemas.microsoft.com/office/word/2018/wordml/cex" xmlns:w16cid="http://schemas.microsoft.com/office/word/2016/wordml/cid" xmlns:w16="http://schemas.microsoft.com/office/word/2018/wordml" xmlns:w16se="http://schemas.microsoft.com/office/word/2015/wordml/symex" xmlns:wpg="http://schemas.microsoft.com/office/word/2010/wordprocessingGroup" xmlns:wpi="http://schemas.microsoft.com/office/word/2010/wordprocessingInk" xmlns:wne="http://schemas.microsoft.com/office/word/2006/wordml" xmlns:wps="http://schemas.microsoft.com/office/word/2010/wordprocessingShape" mc:Ignorable="w14 w15 w16se w16cid w16 w16cex wp14">
+<w:hdr xmlns:wpc="http://schemas.microsoft.com/office/word/2010/wordprocessingCanvas" xmlns:cx="http://schemas.microsoft.com/office/drawing/2014/chartex" xmlns:cx1="http://schemas.microsoft.com/office/drawing/2015/9/8/chartex" xmlns:cx2="http://schemas.microsoft.com/office/drawing/2015/10/21/chartex" xmlns:cx3="http://schemas.microsoft.com/office/drawing/2016/5/9/chartex" xmlns:cx4="http://schemas.microsoft.com/office/drawing/2016/5/10/chartex" xmlns:cx5="http://schemas.microsoft.com/office/drawing/2016/5/11/chartex" xmlns:cx6="http://schemas.microsoft.com/office/drawing/2016/5/12/chartex" xmlns:cx7="http://schemas.microsoft.com/office/drawing/2016/5/13/chartex" xmlns:cx8="http://schemas.microsoft.com/office/drawing/2016/5/14/chartex" xmlns:mc="http://schemas.openxmlformats.org/markup-compatibility/2006" xmlns:aink="http://schemas.microsoft.com/office/drawing/2016/ink" xmlns:am3d="http://schemas.microsoft.com/office/drawing/2017/model3d" xmlns:o="urn:schemas-microsoft-com:office:office" xmlns:oel="http://schemas.microsoft.com/office/2019/extlst" xmlns:r="http://schemas.openxmlformats.org/officeDocument/2006/relationships" xmlns:m="http://schemas.openxmlformats.org/officeDocument/2006/math" xmlns:v="urn:schemas-microsoft-com:vml" xmlns:wp14="http://schemas.microsoft.com/office/word/2010/wordprocessingDrawing" xmlns:wp="http://schemas.openxmlformats.org/drawingml/2006/wordprocessingDrawing" xmlns:w10="urn:schemas-microsoft-com:office:word" xmlns:w="http://schemas.openxmlformats.org/wordprocessingml/2006/main" xmlns:w14="http://schemas.microsoft.com/office/word/2010/wordml" xmlns:w15="http://schemas.microsoft.com/office/word/2012/wordml" xmlns:w16cex="http://schemas.microsoft.com/office/word/2018/wordml/cex" xmlns:w16cid="http://schemas.microsoft.com/office/word/2016/wordml/cid" xmlns:w16="http://schemas.microsoft.com/office/word/2018/wordml" xmlns:w16du="http://schemas.microsoft.com/office/word/2023/wordml/word16du" xmlns:w16sdtdh="http://schemas.microsoft.com/office/word/2020/wordml/sdtdatahash" xmlns:w16sdtfl="http://schemas.microsoft.com/office/word/2024/wordml/sdtformatlock" xmlns:w16se="http://schemas.microsoft.com/office/word/2015/wordml/symex" xmlns:wpg="http://schemas.microsoft.com/office/word/2010/wordprocessingGroup" xmlns:wpi="http://schemas.microsoft.com/office/word/2010/wordprocessingInk" xmlns:wne="http://schemas.microsoft.com/office/word/2006/wordml" xmlns:wps="http://schemas.microsoft.com/office/word/2010/wordprocessingShape" mc:Ignorable="w14 w15 w16se w16cid w16 w16cex w16sdtdh w16sdtfl w16du wp14">
   <w:p>
     <w:pPr>
       <w:pStyle w:val="Cabealho"/>
@@ -8227,7 +8226,7 @@
 </file>
 
 <file path=word/numbering.xml><?xml version="1.0" encoding="utf-8"?>
-<w:numbering xmlns:wpc="http://schemas.microsoft.com/office/word/2010/wordprocessingCanvas" xmlns:cx="http://schemas.microsoft.com/office/drawing/2014/chartex" xmlns:cx1="http://schemas.microsoft.com/office/drawing/2015/9/8/chartex" xmlns:cx2="http://schemas.microsoft.com/office/drawing/2015/10/21/chartex" xmlns:cx3="http://schemas.microsoft.com/office/drawing/2016/5/9/chartex" xmlns:cx4="http://schemas.microsoft.com/office/drawing/2016/5/10/chartex" xmlns:cx5="http://schemas.microsoft.com/office/drawing/2016/5/11/chartex" xmlns:cx6="http://schemas.microsoft.com/office/drawing/2016/5/12/chartex" xmlns:cx7="http://schemas.microsoft.com/office/drawing/2016/5/13/chartex" xmlns:cx8="http://schemas.microsoft.com/office/drawing/2016/5/14/chartex" xmlns:mc="http://schemas.openxmlformats.org/markup-compatibility/2006" xmlns:aink="http://schemas.microsoft.com/office/drawing/2016/ink" xmlns:am3d="http://schemas.microsoft.com/office/drawing/2017/model3d" xmlns:o="urn:schemas-microsoft-com:office:office" xmlns:r="http://schemas.openxmlformats.org/officeDocument/2006/relationships" xmlns:m="http://schemas.openxmlformats.org/officeDocument/2006/math" xmlns:v="urn:schemas-microsoft-com:vml" xmlns:wp14="http://schemas.microsoft.com/office/word/2010/wordprocessingDrawing" xmlns:wp="http://schemas.openxmlformats.org/drawingml/2006/wordprocessingDrawing" xmlns:w10="urn:schemas-microsoft-com:office:word" xmlns:w="http://schemas.openxmlformats.org/wordprocessingml/2006/main" xmlns:w14="http://schemas.microsoft.com/office/word/2010/wordml" xmlns:w15="http://schemas.microsoft.com/office/word/2012/wordml" xmlns:w16cex="http://schemas.microsoft.com/office/word/2018/wordml/cex" xmlns:w16cid="http://schemas.microsoft.com/office/word/2016/wordml/cid" xmlns:w16="http://schemas.microsoft.com/office/word/2018/wordml" xmlns:w16se="http://schemas.microsoft.com/office/word/2015/wordml/symex" xmlns:wpg="http://schemas.microsoft.com/office/word/2010/wordprocessingGroup" xmlns:wpi="http://schemas.microsoft.com/office/word/2010/wordprocessingInk" xmlns:wne="http://schemas.microsoft.com/office/word/2006/wordml" xmlns:wps="http://schemas.microsoft.com/office/word/2010/wordprocessingShape" mc:Ignorable="w14 w15 w16se w16cid w16 w16cex wp14">
+<w:numbering xmlns:wpc="http://schemas.microsoft.com/office/word/2010/wordprocessingCanvas" xmlns:cx="http://schemas.microsoft.com/office/drawing/2014/chartex" xmlns:cx1="http://schemas.microsoft.com/office/drawing/2015/9/8/chartex" xmlns:cx2="http://schemas.microsoft.com/office/drawing/2015/10/21/chartex" xmlns:cx3="http://schemas.microsoft.com/office/drawing/2016/5/9/chartex" xmlns:cx4="http://schemas.microsoft.com/office/drawing/2016/5/10/chartex" xmlns:cx5="http://schemas.microsoft.com/office/drawing/2016/5/11/chartex" xmlns:cx6="http://schemas.microsoft.com/office/drawing/2016/5/12/chartex" xmlns:cx7="http://schemas.microsoft.com/office/drawing/2016/5/13/chartex" xmlns:cx8="http://schemas.microsoft.com/office/drawing/2016/5/14/chartex" xmlns:mc="http://schemas.openxmlformats.org/markup-compatibility/2006" xmlns:aink="http://schemas.microsoft.com/office/drawing/2016/ink" xmlns:am3d="http://schemas.microsoft.com/office/drawing/2017/model3d" xmlns:o="urn:schemas-microsoft-com:office:office" xmlns:oel="http://schemas.microsoft.com/office/2019/extlst" xmlns:r="http://schemas.openxmlformats.org/officeDocument/2006/relationships" xmlns:m="http://schemas.openxmlformats.org/officeDocument/2006/math" xmlns:v="urn:schemas-microsoft-com:vml" xmlns:wp14="http://schemas.microsoft.com/office/word/2010/wordprocessingDrawing" xmlns:wp="http://schemas.openxmlformats.org/drawingml/2006/wordprocessingDrawing" xmlns:w10="urn:schemas-microsoft-com:office:word" xmlns:w="http://schemas.openxmlformats.org/wordprocessingml/2006/main" xmlns:w14="http://schemas.microsoft.com/office/word/2010/wordml" xmlns:w15="http://schemas.microsoft.com/office/word/2012/wordml" xmlns:w16cex="http://schemas.microsoft.com/office/word/2018/wordml/cex" xmlns:w16cid="http://schemas.microsoft.com/office/word/2016/wordml/cid" xmlns:w16="http://schemas.microsoft.com/office/word/2018/wordml" xmlns:w16du="http://schemas.microsoft.com/office/word/2023/wordml/word16du" xmlns:w16sdtdh="http://schemas.microsoft.com/office/word/2020/wordml/sdtdatahash" xmlns:w16sdtfl="http://schemas.microsoft.com/office/word/2024/wordml/sdtformatlock" xmlns:w16se="http://schemas.microsoft.com/office/word/2015/wordml/symex" xmlns:wpg="http://schemas.microsoft.com/office/word/2010/wordprocessingGroup" xmlns:wpi="http://schemas.microsoft.com/office/word/2010/wordprocessingInk" xmlns:wne="http://schemas.microsoft.com/office/word/2006/wordml" xmlns:wps="http://schemas.microsoft.com/office/word/2010/wordprocessingShape" mc:Ignorable="w14 w15 w16se w16cid w16 w16cex w16sdtdh w16sdtfl w16du wp14">
   <w:abstractNum w:abstractNumId="0" w15:restartNumberingAfterBreak="0">
     <w:nsid w:val="0AEA7643"/>
     <w:multiLevelType w:val="hybridMultilevel"/>
@@ -10361,64 +10360,64 @@
       </w:rPr>
     </w:lvl>
   </w:abstractNum>
-  <w:num w:numId="1">
+  <w:num w:numId="1" w16cid:durableId="456074116">
     <w:abstractNumId w:val="13"/>
   </w:num>
-  <w:num w:numId="2">
+  <w:num w:numId="2" w16cid:durableId="349963032">
     <w:abstractNumId w:val="6"/>
   </w:num>
-  <w:num w:numId="3">
+  <w:num w:numId="3" w16cid:durableId="1443570080">
     <w:abstractNumId w:val="0"/>
   </w:num>
-  <w:num w:numId="4">
+  <w:num w:numId="4" w16cid:durableId="440228170">
     <w:abstractNumId w:val="16"/>
   </w:num>
-  <w:num w:numId="5">
+  <w:num w:numId="5" w16cid:durableId="1042824782">
     <w:abstractNumId w:val="11"/>
   </w:num>
-  <w:num w:numId="6">
+  <w:num w:numId="6" w16cid:durableId="521742947">
     <w:abstractNumId w:val="10"/>
   </w:num>
-  <w:num w:numId="7">
+  <w:num w:numId="7" w16cid:durableId="732433436">
     <w:abstractNumId w:val="7"/>
   </w:num>
-  <w:num w:numId="8">
+  <w:num w:numId="8" w16cid:durableId="2043749573">
     <w:abstractNumId w:val="18"/>
   </w:num>
-  <w:num w:numId="9">
+  <w:num w:numId="9" w16cid:durableId="1017387378">
     <w:abstractNumId w:val="15"/>
   </w:num>
-  <w:num w:numId="10">
+  <w:num w:numId="10" w16cid:durableId="1305306804">
     <w:abstractNumId w:val="4"/>
   </w:num>
-  <w:num w:numId="11">
+  <w:num w:numId="11" w16cid:durableId="1504659093">
     <w:abstractNumId w:val="3"/>
   </w:num>
-  <w:num w:numId="12">
+  <w:num w:numId="12" w16cid:durableId="94642531">
     <w:abstractNumId w:val="12"/>
   </w:num>
-  <w:num w:numId="13">
+  <w:num w:numId="13" w16cid:durableId="411780608">
     <w:abstractNumId w:val="1"/>
   </w:num>
-  <w:num w:numId="14">
+  <w:num w:numId="14" w16cid:durableId="1045060876">
     <w:abstractNumId w:val="2"/>
   </w:num>
-  <w:num w:numId="15">
+  <w:num w:numId="15" w16cid:durableId="1321812788">
     <w:abstractNumId w:val="9"/>
   </w:num>
-  <w:num w:numId="16">
+  <w:num w:numId="16" w16cid:durableId="2041122562">
     <w:abstractNumId w:val="17"/>
   </w:num>
-  <w:num w:numId="17">
+  <w:num w:numId="17" w16cid:durableId="617415638">
     <w:abstractNumId w:val="5"/>
   </w:num>
-  <w:num w:numId="18">
+  <w:num w:numId="18" w16cid:durableId="876701206">
     <w:abstractNumId w:val="8"/>
   </w:num>
-  <w:num w:numId="19">
+  <w:num w:numId="19" w16cid:durableId="1174566625">
     <w:abstractNumId w:val="14"/>
   </w:num>
-  <w:num w:numId="20">
+  <w:num w:numId="20" w16cid:durableId="543980892">
     <w:abstractNumId w:val="19"/>
   </w:num>
   <w:numIdMacAtCleanup w:val="6"/>
@@ -10426,7 +10425,7 @@
 </file>
 
 <file path=word/styles.xml><?xml version="1.0" encoding="utf-8"?>
-<w:styles xmlns:mc="http://schemas.openxmlformats.org/markup-compatibility/2006" xmlns:r="http://schemas.openxmlformats.org/officeDocument/2006/relationships" xmlns:w="http://schemas.openxmlformats.org/wordprocessingml/2006/main" xmlns:w14="http://schemas.microsoft.com/office/word/2010/wordml" xmlns:w15="http://schemas.microsoft.com/office/word/2012/wordml" xmlns:w16cex="http://schemas.microsoft.com/office/word/2018/wordml/cex" xmlns:w16cid="http://schemas.microsoft.com/office/word/2016/wordml/cid" xmlns:w16="http://schemas.microsoft.com/office/word/2018/wordml" xmlns:w16se="http://schemas.microsoft.com/office/word/2015/wordml/symex" mc:Ignorable="w14 w15 w16se w16cid w16 w16cex">
+<w:styles xmlns:mc="http://schemas.openxmlformats.org/markup-compatibility/2006" xmlns:r="http://schemas.openxmlformats.org/officeDocument/2006/relationships" xmlns:w="http://schemas.openxmlformats.org/wordprocessingml/2006/main" xmlns:w14="http://schemas.microsoft.com/office/word/2010/wordml" xmlns:w15="http://schemas.microsoft.com/office/word/2012/wordml" xmlns:w16cex="http://schemas.microsoft.com/office/word/2018/wordml/cex" xmlns:w16cid="http://schemas.microsoft.com/office/word/2016/wordml/cid" xmlns:w16="http://schemas.microsoft.com/office/word/2018/wordml" xmlns:w16du="http://schemas.microsoft.com/office/word/2023/wordml/word16du" xmlns:w16sdtdh="http://schemas.microsoft.com/office/word/2020/wordml/sdtdatahash" xmlns:w16sdtfl="http://schemas.microsoft.com/office/word/2024/wordml/sdtformatlock" xmlns:w16se="http://schemas.microsoft.com/office/word/2015/wordml/symex" mc:Ignorable="w14 w15 w16se w16cid w16 w16cex w16sdtdh w16sdtfl w16du">
   <w:docDefaults>
     <w:rPrDefault>
       <w:rPr>
@@ -10920,7 +10919,6 @@
   <w:style w:type="character" w:default="1" w:styleId="Fontepargpadro">
     <w:name w:val="Default Paragraph Font"/>
     <w:uiPriority w:val="1"/>
-    <w:semiHidden/>
     <w:unhideWhenUsed/>
   </w:style>
   <w:style w:type="table" w:default="1" w:styleId="Tabelanormal">

</xml_diff>